<commit_message>
Add : to DCP
</commit_message>
<xml_diff>
--- a/frontend/api/templates/DCP.docx
+++ b/frontend/api/templates/DCP.docx
@@ -238,7 +238,29 @@
           <w:rtl/>
           <w:lang w:bidi="ar-DZ"/>
         </w:rPr>
-        <w:t>رقم :...../ المؤرخ :....../......./..........</w:t>
+        <w:t>رقم</w:t>
+      </w:r>
+      <w:proofErr w:type="gramStart"/>
+      <w:r>
+        <w:rPr>
+          <w:rFonts w:ascii="Cambria" w:hAnsi="Cambria" w:hint="cs"/>
+          <w:sz w:val="28"/>
+          <w:szCs w:val="28"/>
+          <w:rtl/>
+          <w:lang w:bidi="ar-DZ"/>
+        </w:rPr>
+        <w:t xml:space="preserve"> :...</w:t>
+      </w:r>
+      <w:proofErr w:type="gramEnd"/>
+      <w:r>
+        <w:rPr>
+          <w:rFonts w:ascii="Cambria" w:hAnsi="Cambria" w:hint="cs"/>
+          <w:sz w:val="28"/>
+          <w:szCs w:val="28"/>
+          <w:rtl/>
+          <w:lang w:bidi="ar-DZ"/>
+        </w:rPr>
+        <w:t>../ المؤرخ :....../......./..........</w:t>
       </w:r>
     </w:p>
     <w:p>
@@ -314,7 +336,20 @@
           <w:rtl/>
           <w:lang w:bidi="ar-DZ"/>
         </w:rPr>
-        <w:t xml:space="preserve">         </w:t>
+        <w:t xml:space="preserve">        </w:t>
+      </w:r>
+      <w:proofErr w:type="gramStart"/>
+      <w:r>
+        <w:rPr>
+          <w:rFonts w:ascii="Arial" w:hAnsi="Arial" w:cs="Arial"/>
+          <w:b/>
+          <w:bCs/>
+          <w:sz w:val="24"/>
+          <w:szCs w:val="24"/>
+          <w:rtl/>
+          <w:lang w:bidi="ar-DZ"/>
+        </w:rPr>
+        <w:t xml:space="preserve"> </w:t>
       </w:r>
       <w:r>
         <w:rPr>
@@ -338,7 +373,20 @@
           <w:rtl/>
           <w:lang w:bidi="ar-DZ"/>
         </w:rPr>
-        <w:t>(1)المستورد</w:t>
+        <w:t>(</w:t>
+      </w:r>
+      <w:proofErr w:type="gramEnd"/>
+      <w:r>
+        <w:rPr>
+          <w:rFonts w:ascii="Arial" w:hAnsi="Arial" w:cs="Arial" w:hint="cs"/>
+          <w:b/>
+          <w:bCs/>
+          <w:sz w:val="24"/>
+          <w:szCs w:val="24"/>
+          <w:rtl/>
+          <w:lang w:bidi="ar-DZ"/>
+        </w:rPr>
+        <w:t>1)المستورد</w:t>
       </w:r>
       <w:r>
         <w:rPr>
@@ -428,6 +476,7 @@
         </w:rPr>
         <w:t xml:space="preserve">  رقم وتاريخ س </w:t>
       </w:r>
+      <w:proofErr w:type="gramStart"/>
       <w:r>
         <w:rPr>
           <w:rFonts w:ascii="Arial" w:hAnsi="Arial" w:cs="Arial" w:hint="cs"/>
@@ -450,7 +499,20 @@
           <w:rtl/>
           <w:lang w:bidi="ar-DZ"/>
         </w:rPr>
-        <w:t>{{رقم_س_ت}}</w:t>
+        <w:t>{</w:t>
+      </w:r>
+      <w:proofErr w:type="gramEnd"/>
+      <w:r>
+        <w:rPr>
+          <w:rFonts w:ascii="Arial" w:hAnsi="Arial" w:cs="Arial" w:hint="cs"/>
+          <w:b/>
+          <w:bCs/>
+          <w:sz w:val="24"/>
+          <w:szCs w:val="24"/>
+          <w:rtl/>
+          <w:lang w:bidi="ar-DZ"/>
+        </w:rPr>
+        <w:t>{رقم_س_ت}}</w:t>
       </w:r>
       <w:r>
         <w:rPr>
@@ -648,19 +710,45 @@
           <w:rtl/>
           <w:lang w:bidi="ar-DZ"/>
         </w:rPr>
-        <w:t xml:space="preserve">     </w:t>
-      </w:r>
-      <w:r>
-        <w:rPr>
-          <w:rFonts w:ascii="Arial" w:hAnsi="Arial" w:cs="Arial"/>
-          <w:b/>
-          <w:bCs/>
-          <w:sz w:val="24"/>
-          <w:szCs w:val="24"/>
-          <w:rtl/>
-          <w:lang w:bidi="ar-DZ"/>
-        </w:rPr>
-        <w:t xml:space="preserve">  (2)العنوان:</w:t>
+        <w:t xml:space="preserve">    </w:t>
+      </w:r>
+      <w:proofErr w:type="gramStart"/>
+      <w:r>
+        <w:rPr>
+          <w:rFonts w:ascii="Arial" w:hAnsi="Arial" w:cs="Arial" w:hint="cs"/>
+          <w:b/>
+          <w:bCs/>
+          <w:sz w:val="24"/>
+          <w:szCs w:val="24"/>
+          <w:rtl/>
+          <w:lang w:bidi="ar-DZ"/>
+        </w:rPr>
+        <w:t xml:space="preserve"> </w:t>
+      </w:r>
+      <w:r>
+        <w:rPr>
+          <w:rFonts w:ascii="Arial" w:hAnsi="Arial" w:cs="Arial"/>
+          <w:b/>
+          <w:bCs/>
+          <w:sz w:val="24"/>
+          <w:szCs w:val="24"/>
+          <w:rtl/>
+          <w:lang w:bidi="ar-DZ"/>
+        </w:rPr>
+        <w:t xml:space="preserve">  (</w:t>
+      </w:r>
+      <w:proofErr w:type="gramEnd"/>
+      <w:r>
+        <w:rPr>
+          <w:rFonts w:ascii="Arial" w:hAnsi="Arial" w:cs="Arial"/>
+          <w:b/>
+          <w:bCs/>
+          <w:sz w:val="24"/>
+          <w:szCs w:val="24"/>
+          <w:rtl/>
+          <w:lang w:bidi="ar-DZ"/>
+        </w:rPr>
+        <w:t>2)العنوان:</w:t>
       </w:r>
       <w:r>
         <w:rPr>
@@ -726,17 +814,31 @@
         </w:rPr>
         <w:t xml:space="preserve">           </w:t>
       </w:r>
-      <w:r>
-        <w:rPr>
-          <w:rFonts w:ascii="Arial" w:hAnsi="Arial" w:cs="Arial"/>
-          <w:b/>
-          <w:bCs/>
-          <w:sz w:val="24"/>
-          <w:szCs w:val="24"/>
-          <w:rtl/>
-          <w:lang w:bidi="ar-DZ"/>
-        </w:rPr>
-        <w:t xml:space="preserve">   (3)تعيين المنتوج:</w:t>
+      <w:proofErr w:type="gramStart"/>
+      <w:r>
+        <w:rPr>
+          <w:rFonts w:ascii="Arial" w:hAnsi="Arial" w:cs="Arial"/>
+          <w:b/>
+          <w:bCs/>
+          <w:sz w:val="24"/>
+          <w:szCs w:val="24"/>
+          <w:rtl/>
+          <w:lang w:bidi="ar-DZ"/>
+        </w:rPr>
+        <w:t xml:space="preserve">   (</w:t>
+      </w:r>
+      <w:proofErr w:type="gramEnd"/>
+      <w:r>
+        <w:rPr>
+          <w:rFonts w:ascii="Arial" w:hAnsi="Arial" w:cs="Arial"/>
+          <w:b/>
+          <w:bCs/>
+          <w:sz w:val="24"/>
+          <w:szCs w:val="24"/>
+          <w:rtl/>
+          <w:lang w:bidi="ar-DZ"/>
+        </w:rPr>
+        <w:t>3)تعيين المنتوج:</w:t>
       </w:r>
       <w:r>
         <w:rPr>
@@ -816,6 +918,7 @@
         </w:rPr>
         <w:t xml:space="preserve">           </w:t>
       </w:r>
+      <w:proofErr w:type="gramStart"/>
       <w:r>
         <w:rPr>
           <w:rFonts w:ascii="Arial" w:hAnsi="Arial" w:cs="Arial"/>
@@ -838,7 +941,20 @@
           <w:rtl/>
           <w:lang w:bidi="ar-DZ"/>
         </w:rPr>
-        <w:t xml:space="preserve">  (4)معروض في: </w:t>
+        <w:t xml:space="preserve">  (</w:t>
+      </w:r>
+      <w:proofErr w:type="gramEnd"/>
+      <w:r>
+        <w:rPr>
+          <w:rFonts w:ascii="Arial" w:hAnsi="Arial" w:cs="Arial"/>
+          <w:b/>
+          <w:bCs/>
+          <w:sz w:val="24"/>
+          <w:szCs w:val="24"/>
+          <w:rtl/>
+          <w:lang w:bidi="ar-DZ"/>
+        </w:rPr>
+        <w:t xml:space="preserve">4)معروض في: </w:t>
       </w:r>
       <w:r>
         <w:rPr>
@@ -1040,17 +1156,31 @@
         </w:rPr>
         <w:t xml:space="preserve">   </w:t>
       </w:r>
-      <w:r>
-        <w:rPr>
-          <w:rFonts w:ascii="Arial" w:hAnsi="Arial" w:cs="Arial"/>
-          <w:b/>
-          <w:bCs/>
-          <w:sz w:val="24"/>
-          <w:szCs w:val="24"/>
-          <w:rtl/>
-          <w:lang w:bidi="ar-DZ"/>
-        </w:rPr>
-        <w:t xml:space="preserve">   (6)الكمية:</w:t>
+      <w:proofErr w:type="gramStart"/>
+      <w:r>
+        <w:rPr>
+          <w:rFonts w:ascii="Arial" w:hAnsi="Arial" w:cs="Arial"/>
+          <w:b/>
+          <w:bCs/>
+          <w:sz w:val="24"/>
+          <w:szCs w:val="24"/>
+          <w:rtl/>
+          <w:lang w:bidi="ar-DZ"/>
+        </w:rPr>
+        <w:t xml:space="preserve">   (</w:t>
+      </w:r>
+      <w:proofErr w:type="gramEnd"/>
+      <w:r>
+        <w:rPr>
+          <w:rFonts w:ascii="Arial" w:hAnsi="Arial" w:cs="Arial"/>
+          <w:b/>
+          <w:bCs/>
+          <w:sz w:val="24"/>
+          <w:szCs w:val="24"/>
+          <w:rtl/>
+          <w:lang w:bidi="ar-DZ"/>
+        </w:rPr>
+        <w:t>6)الكمية:</w:t>
       </w:r>
       <w:r>
         <w:rPr>
@@ -1222,6 +1352,7 @@
         </w:rPr>
         <w:t xml:space="preserve">     </w:t>
       </w:r>
+      <w:proofErr w:type="gramStart"/>
       <w:r>
         <w:rPr>
           <w:rFonts w:ascii="Arial" w:hAnsi="Arial" w:cs="Arial" w:hint="cs"/>
@@ -1244,7 +1375,20 @@
           <w:rtl/>
           <w:lang w:bidi="ar-DZ"/>
         </w:rPr>
-        <w:t>(8)فاتورة الشراء</w:t>
+        <w:t>(</w:t>
+      </w:r>
+      <w:proofErr w:type="gramEnd"/>
+      <w:r>
+        <w:rPr>
+          <w:rFonts w:ascii="Arial" w:hAnsi="Arial" w:cs="Arial"/>
+          <w:b/>
+          <w:bCs/>
+          <w:sz w:val="24"/>
+          <w:szCs w:val="24"/>
+          <w:rtl/>
+          <w:lang w:bidi="ar-DZ"/>
+        </w:rPr>
+        <w:t>8)فاتورة الشراء</w:t>
       </w:r>
       <w:r>
         <w:rPr>
@@ -1443,6 +1587,7 @@
         </w:rPr>
         <w:t xml:space="preserve">              </w:t>
       </w:r>
+      <w:proofErr w:type="gramStart"/>
       <w:r>
         <w:rPr>
           <w:rFonts w:ascii="Arial" w:hAnsi="Arial" w:cs="Arial"/>
@@ -1464,7 +1609,19 @@
           <w:szCs w:val="24"/>
           <w:lang w:val="en-US" w:bidi="ar-DZ"/>
         </w:rPr>
-        <w:t>القيمة_بالدينار</w:t>
+        <w:t>القيمة</w:t>
+      </w:r>
+      <w:proofErr w:type="gramEnd"/>
+      <w:r>
+        <w:rPr>
+          <w:rFonts w:ascii="Arial" w:hAnsi="Arial" w:cs="Arial"/>
+          <w:b/>
+          <w:bCs/>
+          <w:sz w:val="24"/>
+          <w:szCs w:val="24"/>
+          <w:lang w:val="en-US" w:bidi="ar-DZ"/>
+        </w:rPr>
+        <w:t>_بالدينار</w:t>
       </w:r>
       <w:proofErr w:type="spellEnd"/>
       <w:r>
@@ -1631,6 +1788,7 @@
           <w:lang w:val="en-US" w:bidi="ar-DZ"/>
         </w:rPr>
       </w:pPr>
+      <w:proofErr w:type="gramStart"/>
       <w:r>
         <w:rPr>
           <w:rFonts w:ascii="Cambria" w:hAnsi="Cambria"/>
@@ -1651,6 +1809,7 @@
         <w:t>الصانع</w:t>
       </w:r>
       <w:proofErr w:type="spellEnd"/>
+      <w:proofErr w:type="gramEnd"/>
       <w:r>
         <w:rPr>
           <w:rFonts w:ascii="Cambria" w:hAnsi="Cambria"/>
@@ -1802,19 +1961,45 @@
           <w:rtl/>
           <w:lang w:bidi="ar-DZ"/>
         </w:rPr>
-        <w:t xml:space="preserve">   </w:t>
-      </w:r>
-      <w:r>
-        <w:rPr>
-          <w:rFonts w:ascii="Arial" w:hAnsi="Arial" w:cs="Arial"/>
-          <w:b/>
-          <w:bCs/>
-          <w:sz w:val="24"/>
-          <w:szCs w:val="24"/>
-          <w:rtl/>
-          <w:lang w:bidi="ar-DZ"/>
-        </w:rPr>
-        <w:t xml:space="preserve"> (11) مكان المصدر :</w:t>
+        <w:t xml:space="preserve"> </w:t>
+      </w:r>
+      <w:proofErr w:type="gramStart"/>
+      <w:r>
+        <w:rPr>
+          <w:rFonts w:ascii="Arial" w:hAnsi="Arial" w:cs="Arial"/>
+          <w:b/>
+          <w:bCs/>
+          <w:sz w:val="24"/>
+          <w:szCs w:val="24"/>
+          <w:rtl/>
+          <w:lang w:bidi="ar-DZ"/>
+        </w:rPr>
+        <w:t xml:space="preserve">  </w:t>
+      </w:r>
+      <w:r>
+        <w:rPr>
+          <w:rFonts w:ascii="Arial" w:hAnsi="Arial" w:cs="Arial"/>
+          <w:b/>
+          <w:bCs/>
+          <w:sz w:val="24"/>
+          <w:szCs w:val="24"/>
+          <w:rtl/>
+          <w:lang w:bidi="ar-DZ"/>
+        </w:rPr>
+        <w:t xml:space="preserve"> (</w:t>
+      </w:r>
+      <w:proofErr w:type="gramEnd"/>
+      <w:r>
+        <w:rPr>
+          <w:rFonts w:ascii="Arial" w:hAnsi="Arial" w:cs="Arial"/>
+          <w:b/>
+          <w:bCs/>
+          <w:sz w:val="24"/>
+          <w:szCs w:val="24"/>
+          <w:rtl/>
+          <w:lang w:bidi="ar-DZ"/>
+        </w:rPr>
+        <w:t>11) مكان المصدر :</w:t>
       </w:r>
       <w:r>
         <w:rPr>
@@ -1906,6 +2091,7 @@
         </w:rPr>
         <w:t xml:space="preserve">       </w:t>
       </w:r>
+      <w:proofErr w:type="gramStart"/>
       <w:r>
         <w:rPr>
           <w:rFonts w:ascii="Arial" w:hAnsi="Arial" w:cs="Arial"/>
@@ -1928,7 +2114,20 @@
           <w:rtl/>
           <w:lang w:bidi="ar-DZ"/>
         </w:rPr>
-        <w:t xml:space="preserve"> (12) رقم </w:t>
+        <w:t xml:space="preserve"> (</w:t>
+      </w:r>
+      <w:proofErr w:type="gramEnd"/>
+      <w:r>
+        <w:rPr>
+          <w:rFonts w:ascii="Arial" w:hAnsi="Arial" w:cs="Arial"/>
+          <w:b/>
+          <w:bCs/>
+          <w:sz w:val="24"/>
+          <w:szCs w:val="24"/>
+          <w:rtl/>
+          <w:lang w:bidi="ar-DZ"/>
+        </w:rPr>
+        <w:t xml:space="preserve">12) رقم </w:t>
       </w:r>
       <w:r>
         <w:rPr>
@@ -2006,19 +2205,45 @@
           <w:rtl/>
           <w:lang w:bidi="ar-DZ"/>
         </w:rPr>
-        <w:t xml:space="preserve">    </w:t>
-      </w:r>
-      <w:r>
-        <w:rPr>
-          <w:rFonts w:ascii="Arial" w:hAnsi="Arial" w:cs="Arial"/>
-          <w:b/>
-          <w:bCs/>
-          <w:sz w:val="24"/>
-          <w:szCs w:val="24"/>
-          <w:rtl/>
-          <w:lang w:bidi="ar-DZ"/>
-        </w:rPr>
-        <w:t xml:space="preserve">  (13) اشهاد المنتوج :.....شهادة المنشأ</w:t>
+        <w:t xml:space="preserve">   </w:t>
+      </w:r>
+      <w:proofErr w:type="gramStart"/>
+      <w:r>
+        <w:rPr>
+          <w:rFonts w:ascii="Arial" w:hAnsi="Arial" w:cs="Arial"/>
+          <w:b/>
+          <w:bCs/>
+          <w:sz w:val="24"/>
+          <w:szCs w:val="24"/>
+          <w:rtl/>
+          <w:lang w:bidi="ar-DZ"/>
+        </w:rPr>
+        <w:t xml:space="preserve"> </w:t>
+      </w:r>
+      <w:r>
+        <w:rPr>
+          <w:rFonts w:ascii="Arial" w:hAnsi="Arial" w:cs="Arial"/>
+          <w:b/>
+          <w:bCs/>
+          <w:sz w:val="24"/>
+          <w:szCs w:val="24"/>
+          <w:rtl/>
+          <w:lang w:bidi="ar-DZ"/>
+        </w:rPr>
+        <w:t xml:space="preserve">  (</w:t>
+      </w:r>
+      <w:proofErr w:type="gramEnd"/>
+      <w:r>
+        <w:rPr>
+          <w:rFonts w:ascii="Arial" w:hAnsi="Arial" w:cs="Arial"/>
+          <w:b/>
+          <w:bCs/>
+          <w:sz w:val="24"/>
+          <w:szCs w:val="24"/>
+          <w:rtl/>
+          <w:lang w:bidi="ar-DZ"/>
+        </w:rPr>
+        <w:t>13) اشهاد المنتوج :.....شهادة المنشأ</w:t>
       </w:r>
       <w:r>
         <w:rPr>
@@ -2279,6 +2504,7 @@
           <w:lang w:bidi="ar-DZ"/>
         </w:rPr>
       </w:pPr>
+      <w:proofErr w:type="gramStart"/>
       <w:r>
         <w:rPr>
           <w:rFonts w:ascii="Arial" w:hAnsi="Arial" w:cs="Arial"/>
@@ -2300,7 +2526,19 @@
           <w:szCs w:val="24"/>
           <w:lang w:bidi="ar-DZ"/>
         </w:rPr>
-        <w:t>مرجع_النقل</w:t>
+        <w:t>مرجع</w:t>
+      </w:r>
+      <w:proofErr w:type="gramEnd"/>
+      <w:r>
+        <w:rPr>
+          <w:rFonts w:ascii="Arial" w:hAnsi="Arial" w:cs="Arial"/>
+          <w:b/>
+          <w:bCs/>
+          <w:sz w:val="24"/>
+          <w:szCs w:val="24"/>
+          <w:lang w:bidi="ar-DZ"/>
+        </w:rPr>
+        <w:t>_النقل</w:t>
       </w:r>
       <w:proofErr w:type="spellEnd"/>
       <w:r>
@@ -2316,26 +2554,14 @@
       </w:r>
       <w:r>
         <w:rPr>
-          <w:rFonts w:ascii="Arial" w:hAnsi="Arial" w:cs="Arial" w:hint="cs"/>
-          <w:b/>
-          <w:bCs/>
-          <w:sz w:val="24"/>
-          <w:szCs w:val="24"/>
-          <w:rtl/>
+          <w:rFonts w:ascii="Arial" w:hAnsi="Arial" w:cs="Arial"/>
+          <w:b/>
+          <w:bCs/>
+          <w:sz w:val="24"/>
+          <w:szCs w:val="24"/>
           <w:lang w:bidi="ar-DZ"/>
         </w:rPr>
         <w:t xml:space="preserve"> </w:t>
-      </w:r>
-      <w:r>
-        <w:rPr>
-          <w:rFonts w:ascii="Arial" w:hAnsi="Arial" w:cs="Arial"/>
-          <w:b/>
-          <w:bCs/>
-          <w:sz w:val="24"/>
-          <w:szCs w:val="24"/>
-          <w:lang w:bidi="ar-DZ"/>
-        </w:rPr>
-        <w:t xml:space="preserve">  </w:t>
       </w:r>
       <w:r>
         <w:rPr>
@@ -2412,6 +2638,7 @@
           <w:lang w:bidi="ar-DZ"/>
         </w:rPr>
       </w:pPr>
+      <w:proofErr w:type="gramStart"/>
       <w:r>
         <w:rPr>
           <w:rFonts w:ascii="Cambria" w:hAnsi="Cambria"/>
@@ -2429,7 +2656,17 @@
           <w:bCs/>
           <w:lang w:bidi="ar-DZ"/>
         </w:rPr>
-        <w:t>وثائق_النقل</w:t>
+        <w:t>وثائق</w:t>
+      </w:r>
+      <w:proofErr w:type="gramEnd"/>
+      <w:r>
+        <w:rPr>
+          <w:rFonts w:ascii="Cambria" w:hAnsi="Cambria"/>
+          <w:b/>
+          <w:bCs/>
+          <w:lang w:bidi="ar-DZ"/>
+        </w:rPr>
+        <w:t>_النقل</w:t>
       </w:r>
       <w:proofErr w:type="spellEnd"/>
       <w:r>
@@ -2475,7 +2712,31 @@
           <w:rtl/>
           <w:lang w:bidi="ar-DZ"/>
         </w:rPr>
-        <w:t xml:space="preserve"> (15) وثائق النقل </w:t>
+        <w:t xml:space="preserve"> (15) وثائق النقل</w:t>
+      </w:r>
+      <w:r>
+        <w:rPr>
+          <w:rFonts w:ascii="Arial" w:hAnsi="Arial" w:cs="Arial" w:hint="cs"/>
+          <w:b/>
+          <w:bCs/>
+          <w:sz w:val="24"/>
+          <w:szCs w:val="24"/>
+          <w:rtl/>
+          <w:lang w:bidi="ar-DZ"/>
+        </w:rPr>
+        <w:t>:</w:t>
+      </w:r>
+      <w:r>
+        <w:rPr>
+          <w:rFonts w:ascii="Arial" w:hAnsi="Arial" w:cs="Arial"/>
+          <w:b/>
+          <w:bCs/>
+          <w:sz w:val="24"/>
+          <w:szCs w:val="24"/>
+          <w:rtl/>
+          <w:lang w:bidi="ar-DZ"/>
+        </w:rPr>
+        <w:t xml:space="preserve"> </w:t>
       </w:r>
     </w:p>
     <w:p>
@@ -2527,6 +2788,7 @@
         </w:rPr>
         <w:t xml:space="preserve"> </w:t>
       </w:r>
+      <w:proofErr w:type="gramStart"/>
       <w:r>
         <w:rPr>
           <w:rFonts w:ascii="Arial" w:hAnsi="Arial" w:cs="Arial" w:hint="cs"/>
@@ -2550,7 +2812,20 @@
           <w:rtl/>
           <w:lang w:bidi="ar-DZ"/>
         </w:rPr>
-        <w:t>تاريخ_الانطلاق</w:t>
+        <w:t>تاريخ</w:t>
+      </w:r>
+      <w:proofErr w:type="gramEnd"/>
+      <w:r>
+        <w:rPr>
+          <w:rFonts w:ascii="Arial" w:hAnsi="Arial" w:cs="Arial" w:hint="cs"/>
+          <w:b/>
+          <w:bCs/>
+          <w:sz w:val="24"/>
+          <w:szCs w:val="24"/>
+          <w:rtl/>
+          <w:lang w:bidi="ar-DZ"/>
+        </w:rPr>
+        <w:t>_الانطلاق</w:t>
       </w:r>
       <w:proofErr w:type="spellEnd"/>
       <w:r>
@@ -2703,19 +2978,45 @@
           <w:rtl/>
           <w:lang w:bidi="ar-DZ"/>
         </w:rPr>
-        <w:t xml:space="preserve">تاريخ                       </w:t>
-      </w:r>
-      <w:r>
-        <w:rPr>
-          <w:rFonts w:ascii="Arial" w:hAnsi="Arial" w:cs="Arial"/>
-          <w:b/>
-          <w:bCs/>
-          <w:sz w:val="24"/>
-          <w:szCs w:val="24"/>
-          <w:rtl/>
-          <w:lang w:bidi="ar-DZ"/>
-        </w:rPr>
-        <w:t xml:space="preserve">(16) العبور : </w:t>
+        <w:t xml:space="preserve">تاريخ                    </w:t>
+      </w:r>
+      <w:proofErr w:type="gramStart"/>
+      <w:r>
+        <w:rPr>
+          <w:rFonts w:ascii="Arial" w:hAnsi="Arial" w:cs="Arial"/>
+          <w:b/>
+          <w:bCs/>
+          <w:sz w:val="24"/>
+          <w:szCs w:val="24"/>
+          <w:rtl/>
+          <w:lang w:bidi="ar-DZ"/>
+        </w:rPr>
+        <w:t xml:space="preserve">   </w:t>
+      </w:r>
+      <w:r>
+        <w:rPr>
+          <w:rFonts w:ascii="Arial" w:hAnsi="Arial" w:cs="Arial"/>
+          <w:b/>
+          <w:bCs/>
+          <w:sz w:val="24"/>
+          <w:szCs w:val="24"/>
+          <w:rtl/>
+          <w:lang w:bidi="ar-DZ"/>
+        </w:rPr>
+        <w:t>(</w:t>
+      </w:r>
+      <w:proofErr w:type="gramEnd"/>
+      <w:r>
+        <w:rPr>
+          <w:rFonts w:ascii="Arial" w:hAnsi="Arial" w:cs="Arial"/>
+          <w:b/>
+          <w:bCs/>
+          <w:sz w:val="24"/>
+          <w:szCs w:val="24"/>
+          <w:rtl/>
+          <w:lang w:bidi="ar-DZ"/>
+        </w:rPr>
+        <w:t xml:space="preserve">16) العبور : </w:t>
       </w:r>
       <w:r>
         <w:rPr>
@@ -2805,6 +3106,7 @@
         </w:rPr>
         <w:t xml:space="preserve">                            </w:t>
       </w:r>
+      <w:proofErr w:type="gramStart"/>
       <w:r>
         <w:rPr>
           <w:rFonts w:ascii="Arial" w:hAnsi="Arial" w:cs="Arial"/>
@@ -2828,7 +3130,20 @@
           <w:rtl/>
           <w:lang w:bidi="ar-DZ"/>
         </w:rPr>
-        <w:t xml:space="preserve">:  /   /         </w:t>
+        <w:t>:  /</w:t>
+      </w:r>
+      <w:proofErr w:type="gramEnd"/>
+      <w:r>
+        <w:rPr>
+          <w:rFonts w:ascii="Arial" w:hAnsi="Arial" w:cs="Arial"/>
+          <w:b/>
+          <w:bCs/>
+          <w:sz w:val="24"/>
+          <w:szCs w:val="24"/>
+          <w:rtl/>
+          <w:lang w:bidi="ar-DZ"/>
+        </w:rPr>
+        <w:t xml:space="preserve">   /         </w:t>
       </w:r>
       <w:r>
         <w:rPr>

</xml_diff>

<commit_message>
Fix DCP bidi layout (items 13-16) and date ordering
</commit_message>
<xml_diff>
--- a/frontend/api/templates/DCP.docx
+++ b/frontend/api/templates/DCP.docx
@@ -238,29 +238,7 @@
           <w:rtl/>
           <w:lang w:bidi="ar-DZ"/>
         </w:rPr>
-        <w:t>رقم</w:t>
-      </w:r>
-      <w:proofErr w:type="gramStart"/>
-      <w:r>
-        <w:rPr>
-          <w:rFonts w:ascii="Cambria" w:hAnsi="Cambria" w:hint="cs"/>
-          <w:sz w:val="28"/>
-          <w:szCs w:val="28"/>
-          <w:rtl/>
-          <w:lang w:bidi="ar-DZ"/>
-        </w:rPr>
-        <w:t xml:space="preserve"> :...</w:t>
-      </w:r>
-      <w:proofErr w:type="gramEnd"/>
-      <w:r>
-        <w:rPr>
-          <w:rFonts w:ascii="Cambria" w:hAnsi="Cambria" w:hint="cs"/>
-          <w:sz w:val="28"/>
-          <w:szCs w:val="28"/>
-          <w:rtl/>
-          <w:lang w:bidi="ar-DZ"/>
-        </w:rPr>
-        <w:t>../ المؤرخ :....../......./..........</w:t>
+        <w:t>رقم :...../ المؤرخ :....../......./..........</w:t>
       </w:r>
     </w:p>
     <w:p>
@@ -336,20 +314,7 @@
           <w:rtl/>
           <w:lang w:bidi="ar-DZ"/>
         </w:rPr>
-        <w:t xml:space="preserve">        </w:t>
-      </w:r>
-      <w:proofErr w:type="gramStart"/>
-      <w:r>
-        <w:rPr>
-          <w:rFonts w:ascii="Arial" w:hAnsi="Arial" w:cs="Arial"/>
-          <w:b/>
-          <w:bCs/>
-          <w:sz w:val="24"/>
-          <w:szCs w:val="24"/>
-          <w:rtl/>
-          <w:lang w:bidi="ar-DZ"/>
-        </w:rPr>
-        <w:t xml:space="preserve"> </w:t>
+        <w:t xml:space="preserve">         </w:t>
       </w:r>
       <w:r>
         <w:rPr>
@@ -373,20 +338,7 @@
           <w:rtl/>
           <w:lang w:bidi="ar-DZ"/>
         </w:rPr>
-        <w:t>(</w:t>
-      </w:r>
-      <w:proofErr w:type="gramEnd"/>
-      <w:r>
-        <w:rPr>
-          <w:rFonts w:ascii="Arial" w:hAnsi="Arial" w:cs="Arial" w:hint="cs"/>
-          <w:b/>
-          <w:bCs/>
-          <w:sz w:val="24"/>
-          <w:szCs w:val="24"/>
-          <w:rtl/>
-          <w:lang w:bidi="ar-DZ"/>
-        </w:rPr>
-        <w:t>1)المستورد</w:t>
+        <w:t>(1)المستورد</w:t>
       </w:r>
       <w:r>
         <w:rPr>
@@ -476,7 +428,6 @@
         </w:rPr>
         <w:t xml:space="preserve">  رقم وتاريخ س </w:t>
       </w:r>
-      <w:proofErr w:type="gramStart"/>
       <w:r>
         <w:rPr>
           <w:rFonts w:ascii="Arial" w:hAnsi="Arial" w:cs="Arial" w:hint="cs"/>
@@ -499,20 +450,7 @@
           <w:rtl/>
           <w:lang w:bidi="ar-DZ"/>
         </w:rPr>
-        <w:t>{</w:t>
-      </w:r>
-      <w:proofErr w:type="gramEnd"/>
-      <w:r>
-        <w:rPr>
-          <w:rFonts w:ascii="Arial" w:hAnsi="Arial" w:cs="Arial" w:hint="cs"/>
-          <w:b/>
-          <w:bCs/>
-          <w:sz w:val="24"/>
-          <w:szCs w:val="24"/>
-          <w:rtl/>
-          <w:lang w:bidi="ar-DZ"/>
-        </w:rPr>
-        <w:t>{رقم_س_ت}}</w:t>
+        <w:t>{{رقم_س_ت}}</w:t>
       </w:r>
       <w:r>
         <w:rPr>
@@ -710,45 +648,19 @@
           <w:rtl/>
           <w:lang w:bidi="ar-DZ"/>
         </w:rPr>
-        <w:t xml:space="preserve">    </w:t>
-      </w:r>
-      <w:proofErr w:type="gramStart"/>
-      <w:r>
-        <w:rPr>
-          <w:rFonts w:ascii="Arial" w:hAnsi="Arial" w:cs="Arial" w:hint="cs"/>
-          <w:b/>
-          <w:bCs/>
-          <w:sz w:val="24"/>
-          <w:szCs w:val="24"/>
-          <w:rtl/>
-          <w:lang w:bidi="ar-DZ"/>
-        </w:rPr>
-        <w:t xml:space="preserve"> </w:t>
-      </w:r>
-      <w:r>
-        <w:rPr>
-          <w:rFonts w:ascii="Arial" w:hAnsi="Arial" w:cs="Arial"/>
-          <w:b/>
-          <w:bCs/>
-          <w:sz w:val="24"/>
-          <w:szCs w:val="24"/>
-          <w:rtl/>
-          <w:lang w:bidi="ar-DZ"/>
-        </w:rPr>
-        <w:t xml:space="preserve">  (</w:t>
-      </w:r>
-      <w:proofErr w:type="gramEnd"/>
-      <w:r>
-        <w:rPr>
-          <w:rFonts w:ascii="Arial" w:hAnsi="Arial" w:cs="Arial"/>
-          <w:b/>
-          <w:bCs/>
-          <w:sz w:val="24"/>
-          <w:szCs w:val="24"/>
-          <w:rtl/>
-          <w:lang w:bidi="ar-DZ"/>
-        </w:rPr>
-        <w:t>2)العنوان:</w:t>
+        <w:t xml:space="preserve">     </w:t>
+      </w:r>
+      <w:r>
+        <w:rPr>
+          <w:rFonts w:ascii="Arial" w:hAnsi="Arial" w:cs="Arial"/>
+          <w:b/>
+          <w:bCs/>
+          <w:sz w:val="24"/>
+          <w:szCs w:val="24"/>
+          <w:rtl/>
+          <w:lang w:bidi="ar-DZ"/>
+        </w:rPr>
+        <w:t xml:space="preserve">  (2)العنوان:</w:t>
       </w:r>
       <w:r>
         <w:rPr>
@@ -814,31 +726,17 @@
         </w:rPr>
         <w:t xml:space="preserve">           </w:t>
       </w:r>
-      <w:proofErr w:type="gramStart"/>
-      <w:r>
-        <w:rPr>
-          <w:rFonts w:ascii="Arial" w:hAnsi="Arial" w:cs="Arial"/>
-          <w:b/>
-          <w:bCs/>
-          <w:sz w:val="24"/>
-          <w:szCs w:val="24"/>
-          <w:rtl/>
-          <w:lang w:bidi="ar-DZ"/>
-        </w:rPr>
-        <w:t xml:space="preserve">   (</w:t>
-      </w:r>
-      <w:proofErr w:type="gramEnd"/>
-      <w:r>
-        <w:rPr>
-          <w:rFonts w:ascii="Arial" w:hAnsi="Arial" w:cs="Arial"/>
-          <w:b/>
-          <w:bCs/>
-          <w:sz w:val="24"/>
-          <w:szCs w:val="24"/>
-          <w:rtl/>
-          <w:lang w:bidi="ar-DZ"/>
-        </w:rPr>
-        <w:t>3)تعيين المنتوج:</w:t>
+      <w:r>
+        <w:rPr>
+          <w:rFonts w:ascii="Arial" w:hAnsi="Arial" w:cs="Arial"/>
+          <w:b/>
+          <w:bCs/>
+          <w:sz w:val="24"/>
+          <w:szCs w:val="24"/>
+          <w:rtl/>
+          <w:lang w:bidi="ar-DZ"/>
+        </w:rPr>
+        <w:t xml:space="preserve">   (3)تعيين المنتوج:</w:t>
       </w:r>
       <w:r>
         <w:rPr>
@@ -918,7 +816,6 @@
         </w:rPr>
         <w:t xml:space="preserve">           </w:t>
       </w:r>
-      <w:proofErr w:type="gramStart"/>
       <w:r>
         <w:rPr>
           <w:rFonts w:ascii="Arial" w:hAnsi="Arial" w:cs="Arial"/>
@@ -941,20 +838,7 @@
           <w:rtl/>
           <w:lang w:bidi="ar-DZ"/>
         </w:rPr>
-        <w:t xml:space="preserve">  (</w:t>
-      </w:r>
-      <w:proofErr w:type="gramEnd"/>
-      <w:r>
-        <w:rPr>
-          <w:rFonts w:ascii="Arial" w:hAnsi="Arial" w:cs="Arial"/>
-          <w:b/>
-          <w:bCs/>
-          <w:sz w:val="24"/>
-          <w:szCs w:val="24"/>
-          <w:rtl/>
-          <w:lang w:bidi="ar-DZ"/>
-        </w:rPr>
-        <w:t xml:space="preserve">4)معروض في: </w:t>
+        <w:t xml:space="preserve">  (4)معروض في: </w:t>
       </w:r>
       <w:r>
         <w:rPr>
@@ -1156,31 +1040,17 @@
         </w:rPr>
         <w:t xml:space="preserve">   </w:t>
       </w:r>
-      <w:proofErr w:type="gramStart"/>
-      <w:r>
-        <w:rPr>
-          <w:rFonts w:ascii="Arial" w:hAnsi="Arial" w:cs="Arial"/>
-          <w:b/>
-          <w:bCs/>
-          <w:sz w:val="24"/>
-          <w:szCs w:val="24"/>
-          <w:rtl/>
-          <w:lang w:bidi="ar-DZ"/>
-        </w:rPr>
-        <w:t xml:space="preserve">   (</w:t>
-      </w:r>
-      <w:proofErr w:type="gramEnd"/>
-      <w:r>
-        <w:rPr>
-          <w:rFonts w:ascii="Arial" w:hAnsi="Arial" w:cs="Arial"/>
-          <w:b/>
-          <w:bCs/>
-          <w:sz w:val="24"/>
-          <w:szCs w:val="24"/>
-          <w:rtl/>
-          <w:lang w:bidi="ar-DZ"/>
-        </w:rPr>
-        <w:t>6)الكمية:</w:t>
+      <w:r>
+        <w:rPr>
+          <w:rFonts w:ascii="Arial" w:hAnsi="Arial" w:cs="Arial"/>
+          <w:b/>
+          <w:bCs/>
+          <w:sz w:val="24"/>
+          <w:szCs w:val="24"/>
+          <w:rtl/>
+          <w:lang w:bidi="ar-DZ"/>
+        </w:rPr>
+        <w:t xml:space="preserve">   (6)الكمية:</w:t>
       </w:r>
       <w:r>
         <w:rPr>
@@ -1352,7 +1222,6 @@
         </w:rPr>
         <w:t xml:space="preserve">     </w:t>
       </w:r>
-      <w:proofErr w:type="gramStart"/>
       <w:r>
         <w:rPr>
           <w:rFonts w:ascii="Arial" w:hAnsi="Arial" w:cs="Arial" w:hint="cs"/>
@@ -1375,20 +1244,7 @@
           <w:rtl/>
           <w:lang w:bidi="ar-DZ"/>
         </w:rPr>
-        <w:t>(</w:t>
-      </w:r>
-      <w:proofErr w:type="gramEnd"/>
-      <w:r>
-        <w:rPr>
-          <w:rFonts w:ascii="Arial" w:hAnsi="Arial" w:cs="Arial"/>
-          <w:b/>
-          <w:bCs/>
-          <w:sz w:val="24"/>
-          <w:szCs w:val="24"/>
-          <w:rtl/>
-          <w:lang w:bidi="ar-DZ"/>
-        </w:rPr>
-        <w:t>8)فاتورة الشراء</w:t>
+        <w:t>(8)فاتورة الشراء</w:t>
       </w:r>
       <w:r>
         <w:rPr>
@@ -1578,6 +1434,98 @@
       </w:pPr>
       <w:r>
         <w:rPr>
+          <w:rFonts w:ascii="Arial" w:hAnsi="Arial" w:cs="Arial" w:hint="cs"/>
+          <w:b/>
+          <w:bCs/>
+          <w:sz w:val="24"/>
+          <w:szCs w:val="24"/>
+          <w:rtl/>
+          <w:lang w:bidi="ar-DZ"/>
+        </w:rPr>
+        <w:t>بتاريخ</w:t>
+      </w:r>
+      <w:r>
+        <w:rPr>
+          <w:rFonts w:ascii="Arial" w:hAnsi="Arial" w:cs="Arial"/>
+          <w:b/>
+          <w:bCs/>
+          <w:sz w:val="24"/>
+          <w:szCs w:val="24"/>
+          <w:rtl/>
+          <w:lang w:bidi="ar-DZ"/>
+        </w:rPr>
+        <w:t>:</w:t>
+      </w:r>
+      <w:r>
+        <w:rPr>
+          <w:rFonts w:ascii="Arial" w:hAnsi="Arial" w:cs="Arial"/>
+          <w:b/>
+          <w:bCs/>
+          <w:sz w:val="24"/>
+          <w:szCs w:val="24"/>
+          <w:lang w:val="en-US" w:bidi="ar-DZ"/>
+        </w:rPr>
+        <w:t xml:space="preserve"> </w:t>
+      </w:r>
+      <w:r>
+        <w:rPr>
+          <w:rFonts w:ascii="Arial" w:hAnsi="Arial" w:cs="Arial"/>
+          <w:b/>
+          <w:bCs/>
+          <w:sz w:val="24"/>
+          <w:szCs w:val="24"/>
+          <w:lang w:val="en-US" w:bidi="ar-DZ"/>
+        </w:rPr>
+        <w:t xml:space="preserve">               {{ </w:t>
+      </w:r>
+      <w:r>
+        <w:rPr>
+          <w:rFonts w:ascii="Arial" w:hAnsi="Arial" w:cs="Arial" w:hint="cs"/>
+          <w:b/>
+          <w:bCs/>
+          <w:sz w:val="24"/>
+          <w:szCs w:val="24"/>
+          <w:rtl/>
+          <w:lang w:val="en-US" w:bidi="ar-DZ"/>
+        </w:rPr>
+        <w:t>الفاتورة</w:t>
+      </w:r>
+      <w:r>
+        <w:rPr>
+          <w:rFonts w:ascii="Arial" w:hAnsi="Arial" w:cs="Arial"/>
+          <w:b/>
+          <w:bCs/>
+          <w:sz w:val="24"/>
+          <w:szCs w:val="24"/>
+          <w:lang w:val="en-US" w:bidi="ar-DZ"/>
+        </w:rPr>
+        <w:t>_</w:t>
+      </w:r>
+      <w:r>
+        <w:rPr>
+          <w:rFonts w:ascii="Arial" w:hAnsi="Arial" w:cs="Arial" w:hint="cs"/>
+          <w:b/>
+          <w:bCs/>
+          <w:sz w:val="24"/>
+          <w:szCs w:val="24"/>
+          <w:rtl/>
+          <w:lang w:val="en-US" w:bidi="ar-DZ"/>
+        </w:rPr>
+        <w:t>تاريخ</w:t>
+      </w:r>
+      <w:r>
+        <w:rPr>
+          <w:rFonts w:ascii="Arial" w:hAnsi="Arial" w:cs="Arial"/>
+          <w:b/>
+          <w:bCs/>
+          <w:sz w:val="24"/>
+          <w:szCs w:val="24"/>
+          <w:lang w:val="en-US" w:bidi="ar-DZ"/>
+        </w:rPr>
+        <w:t xml:space="preserve">}}   </w:t>
+      </w:r>
+      <w:r>
+        <w:rPr>
           <w:rFonts w:ascii="Arial" w:hAnsi="Arial" w:cs="Arial"/>
           <w:b/>
           <w:bCs/>
@@ -1587,7 +1535,6 @@
         </w:rPr>
         <w:t xml:space="preserve">              </w:t>
       </w:r>
-      <w:proofErr w:type="gramStart"/>
       <w:r>
         <w:rPr>
           <w:rFonts w:ascii="Arial" w:hAnsi="Arial" w:cs="Arial"/>
@@ -1597,9 +1544,52 @@
           <w:szCs w:val="24"/>
           <w:lang w:val="en-US" w:bidi="ar-DZ"/>
         </w:rPr>
+        <w:t xml:space="preserve">  </w:t>
+      </w:r>
+      <w:r>
+        <w:rPr>
+          <w:rFonts w:ascii="Arial" w:hAnsi="Arial" w:cs="Arial"/>
+          <w:b/>
+          <w:bCs/>
+          <w:sz w:val="24"/>
+          <w:szCs w:val="24"/>
+          <w:lang w:val="en-US" w:bidi="ar-DZ"/>
+        </w:rPr>
+        <w:t xml:space="preserve"> </w:t>
+      </w:r>
+      <w:r>
+        <w:rPr>
+          <w:rFonts w:ascii="Arial" w:hAnsi="Arial" w:cs="Arial"/>
+          <w:b/>
+          <w:bCs/>
+          <w:sz w:val="24"/>
+          <w:szCs w:val="24"/>
+          <w:lang w:val="en-US" w:bidi="ar-DZ"/>
+        </w:rPr>
+        <w:t xml:space="preserve">  </w:t>
+      </w:r>
+      <w:r>
+        <w:rPr>
+          <w:rFonts w:ascii="Arial" w:hAnsi="Arial" w:cs="Arial"/>
+          <w:b/>
+          <w:bCs/>
+          <w:sz w:val="24"/>
+          <w:szCs w:val="24"/>
+          <w:lang w:val="en-US" w:bidi="ar-DZ"/>
+        </w:rPr>
+        <w:t xml:space="preserve"> </w:t>
+      </w:r>
+      <w:r>
+        <w:rPr>
+          <w:rFonts w:ascii="Arial" w:hAnsi="Arial" w:cs="Arial"/>
+          <w:b/>
+          <w:bCs/>
+          <w:sz w:val="24"/>
+          <w:szCs w:val="24"/>
+          <w:lang w:val="en-US" w:bidi="ar-DZ"/>
+        </w:rPr>
         <w:t xml:space="preserve">{{ </w:t>
       </w:r>
-      <w:proofErr w:type="spellStart"/>
       <w:r>
         <w:rPr>
           <w:rFonts w:ascii="Arial" w:hAnsi="Arial" w:cs="Arial"/>
@@ -1609,9 +1599,8 @@
           <w:szCs w:val="24"/>
           <w:lang w:val="en-US" w:bidi="ar-DZ"/>
         </w:rPr>
-        <w:t>القيمة</w:t>
-      </w:r>
-      <w:proofErr w:type="gramEnd"/>
+        <w:t>القيمة_بالدينار</w:t>
+      </w:r>
       <w:r>
         <w:rPr>
           <w:rFonts w:ascii="Arial" w:hAnsi="Arial" w:cs="Arial"/>
@@ -1621,155 +1610,7 @@
           <w:szCs w:val="24"/>
           <w:lang w:val="en-US" w:bidi="ar-DZ"/>
         </w:rPr>
-        <w:t>_بالدينار</w:t>
-      </w:r>
-      <w:proofErr w:type="spellEnd"/>
-      <w:r>
-        <w:rPr>
-          <w:rFonts w:ascii="Arial" w:hAnsi="Arial" w:cs="Arial"/>
-          <w:b/>
-          <w:bCs/>
-          <w:sz w:val="24"/>
-          <w:szCs w:val="24"/>
-          <w:lang w:val="en-US" w:bidi="ar-DZ"/>
-        </w:rPr>
         <w:t xml:space="preserve"> }}</w:t>
-      </w:r>
-      <w:r>
-        <w:rPr>
-          <w:rFonts w:ascii="Arial" w:hAnsi="Arial" w:cs="Arial"/>
-          <w:b/>
-          <w:bCs/>
-          <w:sz w:val="24"/>
-          <w:szCs w:val="24"/>
-          <w:lang w:val="en-US" w:bidi="ar-DZ"/>
-        </w:rPr>
-        <w:t xml:space="preserve">  </w:t>
-      </w:r>
-      <w:r>
-        <w:rPr>
-          <w:rFonts w:ascii="Arial" w:hAnsi="Arial" w:cs="Arial"/>
-          <w:b/>
-          <w:bCs/>
-          <w:sz w:val="24"/>
-          <w:szCs w:val="24"/>
-          <w:lang w:val="en-US" w:bidi="ar-DZ"/>
-        </w:rPr>
-        <w:t xml:space="preserve"> </w:t>
-      </w:r>
-      <w:r>
-        <w:rPr>
-          <w:rFonts w:ascii="Arial" w:hAnsi="Arial" w:cs="Arial"/>
-          <w:b/>
-          <w:bCs/>
-          <w:sz w:val="24"/>
-          <w:szCs w:val="24"/>
-          <w:lang w:val="en-US" w:bidi="ar-DZ"/>
-        </w:rPr>
-        <w:t xml:space="preserve">  </w:t>
-      </w:r>
-      <w:r>
-        <w:rPr>
-          <w:rFonts w:ascii="Arial" w:hAnsi="Arial" w:cs="Arial"/>
-          <w:b/>
-          <w:bCs/>
-          <w:sz w:val="24"/>
-          <w:szCs w:val="24"/>
-          <w:lang w:val="en-US" w:bidi="ar-DZ"/>
-        </w:rPr>
-        <w:t xml:space="preserve">               {{ </w:t>
-      </w:r>
-      <w:r>
-        <w:rPr>
-          <w:rFonts w:ascii="Arial" w:hAnsi="Arial" w:cs="Arial" w:hint="cs"/>
-          <w:b/>
-          <w:bCs/>
-          <w:sz w:val="24"/>
-          <w:szCs w:val="24"/>
-          <w:rtl/>
-          <w:lang w:val="en-US" w:bidi="ar-DZ"/>
-        </w:rPr>
-        <w:t>الفاتورة</w:t>
-      </w:r>
-      <w:r>
-        <w:rPr>
-          <w:rFonts w:ascii="Arial" w:hAnsi="Arial" w:cs="Arial"/>
-          <w:b/>
-          <w:bCs/>
-          <w:sz w:val="24"/>
-          <w:szCs w:val="24"/>
-          <w:lang w:val="en-US" w:bidi="ar-DZ"/>
-        </w:rPr>
-        <w:t>_</w:t>
-      </w:r>
-      <w:r>
-        <w:rPr>
-          <w:rFonts w:ascii="Arial" w:hAnsi="Arial" w:cs="Arial" w:hint="cs"/>
-          <w:b/>
-          <w:bCs/>
-          <w:sz w:val="24"/>
-          <w:szCs w:val="24"/>
-          <w:rtl/>
-          <w:lang w:val="en-US" w:bidi="ar-DZ"/>
-        </w:rPr>
-        <w:t>تاريخ</w:t>
-      </w:r>
-      <w:r>
-        <w:rPr>
-          <w:rFonts w:ascii="Arial" w:hAnsi="Arial" w:cs="Arial"/>
-          <w:b/>
-          <w:bCs/>
-          <w:sz w:val="24"/>
-          <w:szCs w:val="24"/>
-          <w:lang w:val="en-US" w:bidi="ar-DZ"/>
-        </w:rPr>
-        <w:t xml:space="preserve">}}   </w:t>
-      </w:r>
-      <w:r>
-        <w:rPr>
-          <w:rFonts w:ascii="Arial" w:hAnsi="Arial" w:cs="Arial"/>
-          <w:b/>
-          <w:bCs/>
-          <w:sz w:val="24"/>
-          <w:szCs w:val="24"/>
-          <w:lang w:val="en-US" w:bidi="ar-DZ"/>
-        </w:rPr>
-        <w:t xml:space="preserve"> </w:t>
-      </w:r>
-      <w:r>
-        <w:rPr>
-          <w:rFonts w:ascii="Arial" w:hAnsi="Arial" w:cs="Arial" w:hint="cs"/>
-          <w:b/>
-          <w:bCs/>
-          <w:sz w:val="24"/>
-          <w:szCs w:val="24"/>
-          <w:rtl/>
-          <w:lang w:bidi="ar-DZ"/>
-        </w:rPr>
-        <w:t>بتاريخ</w:t>
-      </w:r>
-      <w:r>
-        <w:rPr>
-          <w:rFonts w:ascii="Arial" w:hAnsi="Arial" w:cs="Arial"/>
-          <w:b/>
-          <w:bCs/>
-          <w:sz w:val="24"/>
-          <w:szCs w:val="24"/>
-          <w:rtl/>
-          <w:lang w:bidi="ar-DZ"/>
-        </w:rPr>
-        <w:t>:</w:t>
-      </w:r>
-      <w:r>
-        <w:rPr>
-          <w:rFonts w:ascii="Arial" w:hAnsi="Arial" w:cs="Arial"/>
-          <w:b/>
-          <w:bCs/>
-          <w:sz w:val="24"/>
-          <w:szCs w:val="24"/>
-          <w:lang w:val="en-US" w:bidi="ar-DZ"/>
-        </w:rPr>
-        <w:t xml:space="preserve"> </w:t>
       </w:r>
     </w:p>
     <w:p>
@@ -1788,7 +1629,6 @@
           <w:lang w:val="en-US" w:bidi="ar-DZ"/>
         </w:rPr>
       </w:pPr>
-      <w:proofErr w:type="gramStart"/>
       <w:r>
         <w:rPr>
           <w:rFonts w:ascii="Cambria" w:hAnsi="Cambria"/>
@@ -1809,7 +1649,6 @@
         <w:t>الصانع</w:t>
       </w:r>
       <w:proofErr w:type="spellEnd"/>
-      <w:proofErr w:type="gramEnd"/>
       <w:r>
         <w:rPr>
           <w:rFonts w:ascii="Cambria" w:hAnsi="Cambria"/>
@@ -1961,45 +1800,19 @@
           <w:rtl/>
           <w:lang w:bidi="ar-DZ"/>
         </w:rPr>
-        <w:t xml:space="preserve"> </w:t>
-      </w:r>
-      <w:proofErr w:type="gramStart"/>
-      <w:r>
-        <w:rPr>
-          <w:rFonts w:ascii="Arial" w:hAnsi="Arial" w:cs="Arial"/>
-          <w:b/>
-          <w:bCs/>
-          <w:sz w:val="24"/>
-          <w:szCs w:val="24"/>
-          <w:rtl/>
-          <w:lang w:bidi="ar-DZ"/>
-        </w:rPr>
-        <w:t xml:space="preserve">  </w:t>
-      </w:r>
-      <w:r>
-        <w:rPr>
-          <w:rFonts w:ascii="Arial" w:hAnsi="Arial" w:cs="Arial"/>
-          <w:b/>
-          <w:bCs/>
-          <w:sz w:val="24"/>
-          <w:szCs w:val="24"/>
-          <w:rtl/>
-          <w:lang w:bidi="ar-DZ"/>
-        </w:rPr>
-        <w:t xml:space="preserve"> (</w:t>
-      </w:r>
-      <w:proofErr w:type="gramEnd"/>
-      <w:r>
-        <w:rPr>
-          <w:rFonts w:ascii="Arial" w:hAnsi="Arial" w:cs="Arial"/>
-          <w:b/>
-          <w:bCs/>
-          <w:sz w:val="24"/>
-          <w:szCs w:val="24"/>
-          <w:rtl/>
-          <w:lang w:bidi="ar-DZ"/>
-        </w:rPr>
-        <w:t>11) مكان المصدر :</w:t>
+        <w:t xml:space="preserve">   </w:t>
+      </w:r>
+      <w:r>
+        <w:rPr>
+          <w:rFonts w:ascii="Arial" w:hAnsi="Arial" w:cs="Arial"/>
+          <w:b/>
+          <w:bCs/>
+          <w:sz w:val="24"/>
+          <w:szCs w:val="24"/>
+          <w:rtl/>
+          <w:lang w:bidi="ar-DZ"/>
+        </w:rPr>
+        <w:t xml:space="preserve"> (11) مكان المصدر :</w:t>
       </w:r>
       <w:r>
         <w:rPr>
@@ -2091,7 +1904,6 @@
         </w:rPr>
         <w:t xml:space="preserve">       </w:t>
       </w:r>
-      <w:proofErr w:type="gramStart"/>
       <w:r>
         <w:rPr>
           <w:rFonts w:ascii="Arial" w:hAnsi="Arial" w:cs="Arial"/>
@@ -2114,20 +1926,7 @@
           <w:rtl/>
           <w:lang w:bidi="ar-DZ"/>
         </w:rPr>
-        <w:t xml:space="preserve"> (</w:t>
-      </w:r>
-      <w:proofErr w:type="gramEnd"/>
-      <w:r>
-        <w:rPr>
-          <w:rFonts w:ascii="Arial" w:hAnsi="Arial" w:cs="Arial"/>
-          <w:b/>
-          <w:bCs/>
-          <w:sz w:val="24"/>
-          <w:szCs w:val="24"/>
-          <w:rtl/>
-          <w:lang w:bidi="ar-DZ"/>
-        </w:rPr>
-        <w:t xml:space="preserve">12) رقم </w:t>
+        <w:t xml:space="preserve"> (12) رقم </w:t>
       </w:r>
       <w:r>
         <w:rPr>
@@ -2205,45 +2004,19 @@
           <w:rtl/>
           <w:lang w:bidi="ar-DZ"/>
         </w:rPr>
-        <w:t xml:space="preserve">   </w:t>
-      </w:r>
-      <w:proofErr w:type="gramStart"/>
-      <w:r>
-        <w:rPr>
-          <w:rFonts w:ascii="Arial" w:hAnsi="Arial" w:cs="Arial"/>
-          <w:b/>
-          <w:bCs/>
-          <w:sz w:val="24"/>
-          <w:szCs w:val="24"/>
-          <w:rtl/>
-          <w:lang w:bidi="ar-DZ"/>
-        </w:rPr>
-        <w:t xml:space="preserve"> </w:t>
-      </w:r>
-      <w:r>
-        <w:rPr>
-          <w:rFonts w:ascii="Arial" w:hAnsi="Arial" w:cs="Arial"/>
-          <w:b/>
-          <w:bCs/>
-          <w:sz w:val="24"/>
-          <w:szCs w:val="24"/>
-          <w:rtl/>
-          <w:lang w:bidi="ar-DZ"/>
-        </w:rPr>
-        <w:t xml:space="preserve">  (</w:t>
-      </w:r>
-      <w:proofErr w:type="gramEnd"/>
-      <w:r>
-        <w:rPr>
-          <w:rFonts w:ascii="Arial" w:hAnsi="Arial" w:cs="Arial"/>
-          <w:b/>
-          <w:bCs/>
-          <w:sz w:val="24"/>
-          <w:szCs w:val="24"/>
-          <w:rtl/>
-          <w:lang w:bidi="ar-DZ"/>
-        </w:rPr>
-        <w:t>13) اشهاد المنتوج :.....شهادة المنشأ</w:t>
+        <w:t xml:space="preserve">    </w:t>
+      </w:r>
+      <w:r>
+        <w:rPr>
+          <w:rFonts w:ascii="Arial" w:hAnsi="Arial" w:cs="Arial"/>
+          <w:b/>
+          <w:bCs/>
+          <w:sz w:val="24"/>
+          <w:szCs w:val="24"/>
+          <w:rtl/>
+          <w:lang w:bidi="ar-DZ"/>
+        </w:rPr>
+        <w:t xml:space="preserve">  (13) اشهاد المنتوج :.....شهادة المنشأ</w:t>
       </w:r>
       <w:r>
         <w:rPr>
@@ -2504,7 +2277,89 @@
           <w:lang w:bidi="ar-DZ"/>
         </w:rPr>
       </w:pPr>
-      <w:proofErr w:type="gramStart"/>
+      <w:r>
+        <w:rPr>
+          <w:rFonts w:ascii="Arial" w:hAnsi="Arial" w:cs="Arial"/>
+          <w:b/>
+          <w:bCs/>
+          <w:sz w:val="24"/>
+          <w:szCs w:val="24"/>
+          <w:rtl/>
+          <w:lang w:bidi="ar-DZ"/>
+        </w:rPr>
+        <w:tab/>
+      </w:r>
+      <w:r>
+        <w:rPr>
+          <w:rFonts w:ascii="Arial" w:hAnsi="Arial" w:cs="Arial"/>
+          <w:b/>
+          <w:bCs/>
+          <w:sz w:val="24"/>
+          <w:szCs w:val="24"/>
+          <w:rtl/>
+          <w:lang w:bidi="ar-DZ"/>
+        </w:rPr>
+        <w:tab/>
+      </w:r>
+      <w:r>
+        <w:rPr>
+          <w:rFonts w:ascii="Arial" w:hAnsi="Arial" w:cs="Arial"/>
+          <w:b/>
+          <w:bCs/>
+          <w:sz w:val="24"/>
+          <w:szCs w:val="24"/>
+          <w:rtl/>
+          <w:lang w:bidi="ar-DZ"/>
+        </w:rPr>
+        <w:t>13)مرجع الاش</w:t>
+      </w:r>
+      <w:r>
+        <w:rPr>
+          <w:rFonts w:ascii="Arial" w:hAnsi="Arial" w:cs="Arial"/>
+          <w:b/>
+          <w:bCs/>
+          <w:sz w:val="24"/>
+          <w:szCs w:val="24"/>
+          <w:rtl/>
+          <w:lang w:bidi="ar-DZ"/>
+        </w:rPr>
+        <w:t xml:space="preserve">هاد المحتمل للمنتوج           </w:t>
+      </w:r>
+      <w:r>
+        <w:rPr>
+          <w:rFonts w:ascii="Arial" w:hAnsi="Arial" w:cs="Arial"/>
+          <w:b/>
+          <w:bCs/>
+          <w:sz w:val="24"/>
+          <w:szCs w:val="24"/>
+          <w:rtl/>
+          <w:lang w:bidi="ar-DZ"/>
+        </w:rPr>
+        <w:t xml:space="preserve">  (14) مرجع النقل : </w:t>
+      </w:r>
+      <w:r>
+        <w:rPr>
+          <w:rFonts w:ascii="Arial" w:hAnsi="Arial" w:cs="Arial" w:hint="cs"/>
+          <w:b/>
+          <w:bCs/>
+          <w:sz w:val="24"/>
+          <w:szCs w:val="24"/>
+          <w:rtl/>
+          <w:lang w:bidi="ar-DZ"/>
+        </w:rPr>
+        <w:t xml:space="preserve"> </w:t>
+      </w:r>
+      <w:r>
+        <w:rPr>
+          <w:rFonts w:ascii="Arial" w:hAnsi="Arial" w:cs="Arial"/>
+          <w:b/>
+          <w:bCs/>
+          <w:sz w:val="24"/>
+          <w:szCs w:val="24"/>
+          <w:lang w:bidi="ar-DZ"/>
+        </w:rPr>
+        <w:t xml:space="preserve">  </w:t>
+      </w:r>
       <w:r>
         <w:rPr>
           <w:rFonts w:ascii="Arial" w:hAnsi="Arial" w:cs="Arial"/>
@@ -2516,31 +2371,17 @@
         </w:rPr>
         <w:t xml:space="preserve">{{ </w:t>
       </w:r>
-      <w:proofErr w:type="spellStart"/>
-      <w:r>
-        <w:rPr>
-          <w:rFonts w:ascii="Arial" w:hAnsi="Arial" w:cs="Arial"/>
-          <w:b/>
-          <w:bCs/>
-          <w:sz w:val="24"/>
-          <w:szCs w:val="24"/>
-          <w:lang w:bidi="ar-DZ"/>
-        </w:rPr>
-        <w:t>مرجع</w:t>
-      </w:r>
-      <w:proofErr w:type="gramEnd"/>
-      <w:r>
-        <w:rPr>
-          <w:rFonts w:ascii="Arial" w:hAnsi="Arial" w:cs="Arial"/>
-          <w:b/>
-          <w:bCs/>
-          <w:sz w:val="24"/>
-          <w:szCs w:val="24"/>
-          <w:lang w:bidi="ar-DZ"/>
-        </w:rPr>
-        <w:t>_النقل</w:t>
-      </w:r>
-      <w:proofErr w:type="spellEnd"/>
+      <w:r>
+        <w:rPr>
+          <w:rFonts w:ascii="Arial" w:hAnsi="Arial" w:cs="Arial"/>
+          <w:b/>
+          <w:bCs/>
+          <w:sz w:val="24"/>
+          <w:szCs w:val="24"/>
+          <w:lang w:bidi="ar-DZ"/>
+        </w:rPr>
+        <w:t>مرجع_النقل</w:t>
+      </w:r>
       <w:r>
         <w:rPr>
           <w:rFonts w:ascii="Arial" w:hAnsi="Arial" w:cs="Arial"/>
@@ -2551,77 +2392,6 @@
           <w:lang w:bidi="ar-DZ"/>
         </w:rPr>
         <w:t xml:space="preserve"> }}</w:t>
-      </w:r>
-      <w:r>
-        <w:rPr>
-          <w:rFonts w:ascii="Arial" w:hAnsi="Arial" w:cs="Arial"/>
-          <w:b/>
-          <w:bCs/>
-          <w:sz w:val="24"/>
-          <w:szCs w:val="24"/>
-          <w:lang w:bidi="ar-DZ"/>
-        </w:rPr>
-        <w:t xml:space="preserve"> </w:t>
-      </w:r>
-      <w:r>
-        <w:rPr>
-          <w:rFonts w:ascii="Arial" w:hAnsi="Arial" w:cs="Arial"/>
-          <w:b/>
-          <w:bCs/>
-          <w:sz w:val="24"/>
-          <w:szCs w:val="24"/>
-          <w:rtl/>
-          <w:lang w:bidi="ar-DZ"/>
-        </w:rPr>
-        <w:tab/>
-      </w:r>
-      <w:r>
-        <w:rPr>
-          <w:rFonts w:ascii="Arial" w:hAnsi="Arial" w:cs="Arial"/>
-          <w:b/>
-          <w:bCs/>
-          <w:sz w:val="24"/>
-          <w:szCs w:val="24"/>
-          <w:rtl/>
-          <w:lang w:bidi="ar-DZ"/>
-        </w:rPr>
-        <w:tab/>
-      </w:r>
-      <w:r>
-        <w:rPr>
-          <w:rFonts w:ascii="Arial" w:hAnsi="Arial" w:cs="Arial"/>
-          <w:b/>
-          <w:bCs/>
-          <w:sz w:val="24"/>
-          <w:szCs w:val="24"/>
-          <w:rtl/>
-          <w:lang w:bidi="ar-DZ"/>
-        </w:rPr>
-        <w:t>13)مرجع الاش</w:t>
-      </w:r>
-      <w:r>
-        <w:rPr>
-          <w:rFonts w:ascii="Arial" w:hAnsi="Arial" w:cs="Arial"/>
-          <w:b/>
-          <w:bCs/>
-          <w:sz w:val="24"/>
-          <w:szCs w:val="24"/>
-          <w:rtl/>
-          <w:lang w:bidi="ar-DZ"/>
-        </w:rPr>
-        <w:t xml:space="preserve">هاد المحتمل للمنتوج           </w:t>
-      </w:r>
-      <w:r>
-        <w:rPr>
-          <w:rFonts w:ascii="Arial" w:hAnsi="Arial" w:cs="Arial"/>
-          <w:b/>
-          <w:bCs/>
-          <w:sz w:val="24"/>
-          <w:szCs w:val="24"/>
-          <w:rtl/>
-          <w:lang w:bidi="ar-DZ"/>
-        </w:rPr>
-        <w:t xml:space="preserve">  (14) مرجع النقل : </w:t>
       </w:r>
     </w:p>
     <w:p>
@@ -2638,7 +2408,42 @@
           <w:lang w:bidi="ar-DZ"/>
         </w:rPr>
       </w:pPr>
-      <w:proofErr w:type="gramStart"/>
+      <w:r>
+        <w:rPr>
+          <w:rFonts w:ascii="Arial" w:hAnsi="Arial" w:cs="Arial"/>
+          <w:b/>
+          <w:bCs/>
+          <w:sz w:val="24"/>
+          <w:szCs w:val="24"/>
+          <w:rtl/>
+          <w:lang w:bidi="ar-DZ"/>
+        </w:rPr>
+        <w:t xml:space="preserve">14) مرجع وسائل النقل              </w:t>
+      </w:r>
+      <w:r>
+        <w:rPr>
+          <w:rFonts w:ascii="Arial" w:hAnsi="Arial" w:cs="Arial"/>
+          <w:b/>
+          <w:bCs/>
+          <w:sz w:val="24"/>
+          <w:szCs w:val="24"/>
+          <w:rtl/>
+          <w:lang w:bidi="ar-DZ"/>
+        </w:rPr>
+        <w:t xml:space="preserve">           </w:t>
+      </w:r>
+      <w:r>
+        <w:rPr>
+          <w:rFonts w:ascii="Arial" w:hAnsi="Arial" w:cs="Arial"/>
+          <w:b/>
+          <w:bCs/>
+          <w:sz w:val="24"/>
+          <w:szCs w:val="24"/>
+          <w:rtl/>
+          <w:lang w:bidi="ar-DZ"/>
+        </w:rPr>
+        <w:t xml:space="preserve"> (15) وثائق النقل </w:t>
+      </w:r>
       <w:r>
         <w:rPr>
           <w:rFonts w:ascii="Cambria" w:hAnsi="Cambria"/>
@@ -2648,7 +2453,6 @@
         </w:rPr>
         <w:t xml:space="preserve">{{ </w:t>
       </w:r>
-      <w:proofErr w:type="spellStart"/>
       <w:r>
         <w:rPr>
           <w:rFonts w:ascii="Cambria" w:hAnsi="Cambria"/>
@@ -2656,9 +2460,8 @@
           <w:bCs/>
           <w:lang w:bidi="ar-DZ"/>
         </w:rPr>
-        <w:t>وثائق</w:t>
-      </w:r>
-      <w:proofErr w:type="gramEnd"/>
+        <w:t>وثائق_النقل</w:t>
+      </w:r>
       <w:r>
         <w:rPr>
           <w:rFonts w:ascii="Cambria" w:hAnsi="Cambria"/>
@@ -2666,77 +2469,7 @@
           <w:bCs/>
           <w:lang w:bidi="ar-DZ"/>
         </w:rPr>
-        <w:t>_النقل</w:t>
-      </w:r>
-      <w:proofErr w:type="spellEnd"/>
-      <w:r>
-        <w:rPr>
-          <w:rFonts w:ascii="Cambria" w:hAnsi="Cambria"/>
-          <w:b/>
-          <w:bCs/>
-          <w:lang w:bidi="ar-DZ"/>
-        </w:rPr>
         <w:t xml:space="preserve"> }}</w:t>
-      </w:r>
-      <w:r>
-        <w:rPr>
-          <w:rFonts w:ascii="Arial" w:hAnsi="Arial" w:cs="Arial"/>
-          <w:b/>
-          <w:bCs/>
-          <w:sz w:val="24"/>
-          <w:szCs w:val="24"/>
-          <w:rtl/>
-          <w:lang w:bidi="ar-DZ"/>
-        </w:rPr>
-        <w:t xml:space="preserve">14) مرجع وسائل النقل              </w:t>
-      </w:r>
-      <w:r>
-        <w:rPr>
-          <w:rFonts w:ascii="Arial" w:hAnsi="Arial" w:cs="Arial"/>
-          <w:b/>
-          <w:bCs/>
-          <w:sz w:val="24"/>
-          <w:szCs w:val="24"/>
-          <w:rtl/>
-          <w:lang w:bidi="ar-DZ"/>
-        </w:rPr>
-        <w:t xml:space="preserve">           </w:t>
-      </w:r>
-      <w:r>
-        <w:rPr>
-          <w:rFonts w:ascii="Arial" w:hAnsi="Arial" w:cs="Arial"/>
-          <w:b/>
-          <w:bCs/>
-          <w:sz w:val="24"/>
-          <w:szCs w:val="24"/>
-          <w:rtl/>
-          <w:lang w:bidi="ar-DZ"/>
-        </w:rPr>
-        <w:t xml:space="preserve"> (15) وثائق النقل</w:t>
-      </w:r>
-      <w:r>
-        <w:rPr>
-          <w:rFonts w:ascii="Arial" w:hAnsi="Arial" w:cs="Arial" w:hint="cs"/>
-          <w:b/>
-          <w:bCs/>
-          <w:sz w:val="24"/>
-          <w:szCs w:val="24"/>
-          <w:rtl/>
-          <w:lang w:bidi="ar-DZ"/>
-        </w:rPr>
-        <w:t>:</w:t>
-      </w:r>
-      <w:r>
-        <w:rPr>
-          <w:rFonts w:ascii="Arial" w:hAnsi="Arial" w:cs="Arial"/>
-          <w:b/>
-          <w:bCs/>
-          <w:sz w:val="24"/>
-          <w:szCs w:val="24"/>
-          <w:rtl/>
-          <w:lang w:bidi="ar-DZ"/>
-        </w:rPr>
-        <w:t xml:space="preserve"> </w:t>
       </w:r>
     </w:p>
     <w:p>
@@ -2754,6 +2487,104 @@
       </w:pPr>
       <w:r>
         <w:rPr>
+          <w:rFonts w:ascii="Arial" w:hAnsi="Arial" w:cs="Arial"/>
+          <w:b/>
+          <w:bCs/>
+          <w:sz w:val="24"/>
+          <w:szCs w:val="24"/>
+          <w:rtl/>
+          <w:lang w:bidi="ar-DZ"/>
+        </w:rPr>
+        <w:t xml:space="preserve"> مرجع وثائق المرفقة للمنتوج  </w:t>
+      </w:r>
+      <w:r>
+        <w:rPr>
+          <w:rFonts w:ascii="Arial" w:hAnsi="Arial" w:cs="Arial"/>
+          <w:b/>
+          <w:bCs/>
+          <w:sz w:val="24"/>
+          <w:szCs w:val="24"/>
+          <w:rtl/>
+          <w:lang w:bidi="ar-DZ"/>
+        </w:rPr>
+        <w:t xml:space="preserve">        </w:t>
+      </w:r>
+      <w:r>
+        <w:rPr>
+          <w:rFonts w:ascii="Arial" w:hAnsi="Arial" w:cs="Arial"/>
+          <w:b/>
+          <w:bCs/>
+          <w:sz w:val="24"/>
+          <w:szCs w:val="24"/>
+          <w:rtl/>
+          <w:lang w:bidi="ar-DZ"/>
+        </w:rPr>
+        <w:t xml:space="preserve">      </w:t>
+      </w:r>
+      <w:r>
+        <w:rPr>
+          <w:rFonts w:ascii="Arial" w:hAnsi="Arial" w:cs="Arial" w:hint="cs"/>
+          <w:b/>
+          <w:bCs/>
+          <w:sz w:val="24"/>
+          <w:szCs w:val="24"/>
+          <w:rtl/>
+          <w:lang w:bidi="ar-DZ"/>
+        </w:rPr>
+        <w:t xml:space="preserve">  </w:t>
+      </w:r>
+      <w:r>
+        <w:rPr>
+          <w:rFonts w:ascii="Arial" w:hAnsi="Arial" w:cs="Arial"/>
+          <w:b/>
+          <w:bCs/>
+          <w:sz w:val="24"/>
+          <w:szCs w:val="24"/>
+          <w:rtl/>
+          <w:lang w:bidi="ar-DZ"/>
+        </w:rPr>
+        <w:t xml:space="preserve">(16)الانطلاق من :     </w:t>
+      </w:r>
+      <w:r>
+        <w:rPr>
+          <w:rFonts w:ascii="Cambria" w:hAnsi="Cambria"/>
+          <w:b/>
+          <w:bCs/>
+          <w:lang w:bidi="ar-DZ"/>
+        </w:rPr>
+        <w:t xml:space="preserve">{{ </w:t>
+      </w:r>
+      <w:r>
+        <w:rPr>
+          <w:rFonts w:ascii="Cambria" w:hAnsi="Cambria"/>
+          <w:b/>
+          <w:bCs/>
+          <w:lang w:bidi="ar-DZ"/>
+        </w:rPr>
+        <w:t>الانطلاق_من</w:t>
+      </w:r>
+      <w:r>
+        <w:rPr>
+          <w:rFonts w:ascii="Cambria" w:hAnsi="Cambria"/>
+          <w:b/>
+          <w:bCs/>
+          <w:lang w:bidi="ar-DZ"/>
+        </w:rPr>
+        <w:t xml:space="preserve"> }}</w:t>
+      </w:r>
+      <w:r>
+        <w:rPr>
+          <w:rFonts w:ascii="Arial" w:hAnsi="Arial" w:cs="Arial"/>
+          <w:b/>
+          <w:bCs/>
+          <w:sz w:val="24"/>
+          <w:szCs w:val="24"/>
+          <w:lang w:bidi="ar-DZ"/>
+        </w:rPr>
+        <w:t xml:space="preserve"> </w:t>
+      </w:r>
+      <w:r>
+        <w:rPr>
           <w:rFonts w:ascii="Arial" w:hAnsi="Arial" w:cs="Arial" w:hint="cs"/>
           <w:b/>
           <w:bCs/>
@@ -2788,7 +2619,6 @@
         </w:rPr>
         <w:t xml:space="preserve"> </w:t>
       </w:r>
-      <w:proofErr w:type="gramStart"/>
       <w:r>
         <w:rPr>
           <w:rFonts w:ascii="Arial" w:hAnsi="Arial" w:cs="Arial" w:hint="cs"/>
@@ -2801,33 +2631,18 @@
         </w:rPr>
         <w:t xml:space="preserve">{{ </w:t>
       </w:r>
-      <w:proofErr w:type="spellStart"/>
-      <w:r>
-        <w:rPr>
-          <w:rFonts w:ascii="Arial" w:hAnsi="Arial" w:cs="Arial" w:hint="cs"/>
-          <w:b/>
-          <w:bCs/>
-          <w:sz w:val="24"/>
-          <w:szCs w:val="24"/>
-          <w:rtl/>
-          <w:lang w:bidi="ar-DZ"/>
-        </w:rPr>
-        <w:t>تاريخ</w:t>
-      </w:r>
-      <w:proofErr w:type="gramEnd"/>
-      <w:r>
-        <w:rPr>
-          <w:rFonts w:ascii="Arial" w:hAnsi="Arial" w:cs="Arial" w:hint="cs"/>
-          <w:b/>
-          <w:bCs/>
-          <w:sz w:val="24"/>
-          <w:szCs w:val="24"/>
-          <w:rtl/>
-          <w:lang w:bidi="ar-DZ"/>
-        </w:rPr>
-        <w:t>_الانطلاق</w:t>
-      </w:r>
-      <w:proofErr w:type="spellEnd"/>
+      <w:r>
+        <w:rPr>
+          <w:rFonts w:ascii="Arial" w:hAnsi="Arial" w:cs="Arial" w:hint="cs"/>
+          <w:b/>
+          <w:bCs/>
+          <w:sz w:val="24"/>
+          <w:szCs w:val="24"/>
+          <w:rtl/>
+          <w:lang w:bidi="ar-DZ"/>
+        </w:rPr>
+        <w:t>تاريخ_الانطلاق</w:t>
+      </w:r>
       <w:r>
         <w:rPr>
           <w:rFonts w:ascii="Arial" w:hAnsi="Arial" w:cs="Arial" w:hint="cs"/>
@@ -2839,106 +2654,6 @@
           <w:lang w:bidi="ar-DZ"/>
         </w:rPr>
         <w:t xml:space="preserve"> }}</w:t>
-      </w:r>
-      <w:r>
-        <w:rPr>
-          <w:rFonts w:ascii="Arial" w:hAnsi="Arial" w:cs="Arial"/>
-          <w:b/>
-          <w:bCs/>
-          <w:sz w:val="24"/>
-          <w:szCs w:val="24"/>
-          <w:lang w:bidi="ar-DZ"/>
-        </w:rPr>
-        <w:t xml:space="preserve"> </w:t>
-      </w:r>
-      <w:r>
-        <w:rPr>
-          <w:rFonts w:ascii="Cambria" w:hAnsi="Cambria"/>
-          <w:b/>
-          <w:bCs/>
-          <w:lang w:bidi="ar-DZ"/>
-        </w:rPr>
-        <w:t xml:space="preserve">{{ </w:t>
-      </w:r>
-      <w:proofErr w:type="spellStart"/>
-      <w:r>
-        <w:rPr>
-          <w:rFonts w:ascii="Cambria" w:hAnsi="Cambria"/>
-          <w:b/>
-          <w:bCs/>
-          <w:lang w:bidi="ar-DZ"/>
-        </w:rPr>
-        <w:t>الانطلاق_من</w:t>
-      </w:r>
-      <w:proofErr w:type="spellEnd"/>
-      <w:r>
-        <w:rPr>
-          <w:rFonts w:ascii="Cambria" w:hAnsi="Cambria"/>
-          <w:b/>
-          <w:bCs/>
-          <w:lang w:bidi="ar-DZ"/>
-        </w:rPr>
-        <w:t xml:space="preserve"> }}</w:t>
-      </w:r>
-      <w:r>
-        <w:rPr>
-          <w:rFonts w:ascii="Arial" w:hAnsi="Arial" w:cs="Arial"/>
-          <w:b/>
-          <w:bCs/>
-          <w:sz w:val="24"/>
-          <w:szCs w:val="24"/>
-          <w:rtl/>
-          <w:lang w:bidi="ar-DZ"/>
-        </w:rPr>
-        <w:t xml:space="preserve"> مرجع وثائق المرفقة للمنتوج  </w:t>
-      </w:r>
-      <w:r>
-        <w:rPr>
-          <w:rFonts w:ascii="Arial" w:hAnsi="Arial" w:cs="Arial"/>
-          <w:b/>
-          <w:bCs/>
-          <w:sz w:val="24"/>
-          <w:szCs w:val="24"/>
-          <w:rtl/>
-          <w:lang w:bidi="ar-DZ"/>
-        </w:rPr>
-        <w:t xml:space="preserve">        </w:t>
-      </w:r>
-      <w:r>
-        <w:rPr>
-          <w:rFonts w:ascii="Arial" w:hAnsi="Arial" w:cs="Arial"/>
-          <w:b/>
-          <w:bCs/>
-          <w:sz w:val="24"/>
-          <w:szCs w:val="24"/>
-          <w:rtl/>
-          <w:lang w:bidi="ar-DZ"/>
-        </w:rPr>
-        <w:t xml:space="preserve">      </w:t>
-      </w:r>
-      <w:r>
-        <w:rPr>
-          <w:rFonts w:ascii="Arial" w:hAnsi="Arial" w:cs="Arial" w:hint="cs"/>
-          <w:b/>
-          <w:bCs/>
-          <w:sz w:val="24"/>
-          <w:szCs w:val="24"/>
-          <w:rtl/>
-          <w:lang w:bidi="ar-DZ"/>
-        </w:rPr>
-        <w:t xml:space="preserve">  </w:t>
-      </w:r>
-      <w:r>
-        <w:rPr>
-          <w:rFonts w:ascii="Arial" w:hAnsi="Arial" w:cs="Arial"/>
-          <w:b/>
-          <w:bCs/>
-          <w:sz w:val="24"/>
-          <w:szCs w:val="24"/>
-          <w:rtl/>
-          <w:lang w:bidi="ar-DZ"/>
-        </w:rPr>
-        <w:t xml:space="preserve">(16)الانطلاق من :     </w:t>
       </w:r>
     </w:p>
     <w:p>
@@ -2978,45 +2693,19 @@
           <w:rtl/>
           <w:lang w:bidi="ar-DZ"/>
         </w:rPr>
-        <w:t xml:space="preserve">تاريخ                    </w:t>
-      </w:r>
-      <w:proofErr w:type="gramStart"/>
-      <w:r>
-        <w:rPr>
-          <w:rFonts w:ascii="Arial" w:hAnsi="Arial" w:cs="Arial"/>
-          <w:b/>
-          <w:bCs/>
-          <w:sz w:val="24"/>
-          <w:szCs w:val="24"/>
-          <w:rtl/>
-          <w:lang w:bidi="ar-DZ"/>
-        </w:rPr>
-        <w:t xml:space="preserve">   </w:t>
-      </w:r>
-      <w:r>
-        <w:rPr>
-          <w:rFonts w:ascii="Arial" w:hAnsi="Arial" w:cs="Arial"/>
-          <w:b/>
-          <w:bCs/>
-          <w:sz w:val="24"/>
-          <w:szCs w:val="24"/>
-          <w:rtl/>
-          <w:lang w:bidi="ar-DZ"/>
-        </w:rPr>
-        <w:t>(</w:t>
-      </w:r>
-      <w:proofErr w:type="gramEnd"/>
-      <w:r>
-        <w:rPr>
-          <w:rFonts w:ascii="Arial" w:hAnsi="Arial" w:cs="Arial"/>
-          <w:b/>
-          <w:bCs/>
-          <w:sz w:val="24"/>
-          <w:szCs w:val="24"/>
-          <w:rtl/>
-          <w:lang w:bidi="ar-DZ"/>
-        </w:rPr>
-        <w:t xml:space="preserve">16) العبور : </w:t>
+        <w:t xml:space="preserve">تاريخ                       </w:t>
+      </w:r>
+      <w:r>
+        <w:rPr>
+          <w:rFonts w:ascii="Arial" w:hAnsi="Arial" w:cs="Arial"/>
+          <w:b/>
+          <w:bCs/>
+          <w:sz w:val="24"/>
+          <w:szCs w:val="24"/>
+          <w:rtl/>
+          <w:lang w:bidi="ar-DZ"/>
+        </w:rPr>
+        <w:t xml:space="preserve">(16) العبور : </w:t>
       </w:r>
       <w:r>
         <w:rPr>
@@ -3106,7 +2795,6 @@
         </w:rPr>
         <w:t xml:space="preserve">                            </w:t>
       </w:r>
-      <w:proofErr w:type="gramStart"/>
       <w:r>
         <w:rPr>
           <w:rFonts w:ascii="Arial" w:hAnsi="Arial" w:cs="Arial"/>
@@ -3130,20 +2818,7 @@
           <w:rtl/>
           <w:lang w:bidi="ar-DZ"/>
         </w:rPr>
-        <w:t>:  /</w:t>
-      </w:r>
-      <w:proofErr w:type="gramEnd"/>
-      <w:r>
-        <w:rPr>
-          <w:rFonts w:ascii="Arial" w:hAnsi="Arial" w:cs="Arial"/>
-          <w:b/>
-          <w:bCs/>
-          <w:sz w:val="24"/>
-          <w:szCs w:val="24"/>
-          <w:rtl/>
-          <w:lang w:bidi="ar-DZ"/>
-        </w:rPr>
-        <w:t xml:space="preserve">   /         </w:t>
+        <w:t xml:space="preserve">:  /   /         </w:t>
       </w:r>
       <w:r>
         <w:rPr>

</xml_diff>

<commit_message>
Revert "Fix DCP bidi layout (items 13-16) and date ordering"
This reverts commit 4e41caac56b9cafc714733a42cd86fd7d40a578e.
</commit_message>
<xml_diff>
--- a/frontend/api/templates/DCP.docx
+++ b/frontend/api/templates/DCP.docx
@@ -238,7 +238,29 @@
           <w:rtl/>
           <w:lang w:bidi="ar-DZ"/>
         </w:rPr>
-        <w:t>رقم :...../ المؤرخ :....../......./..........</w:t>
+        <w:t>رقم</w:t>
+      </w:r>
+      <w:proofErr w:type="gramStart"/>
+      <w:r>
+        <w:rPr>
+          <w:rFonts w:ascii="Cambria" w:hAnsi="Cambria" w:hint="cs"/>
+          <w:sz w:val="28"/>
+          <w:szCs w:val="28"/>
+          <w:rtl/>
+          <w:lang w:bidi="ar-DZ"/>
+        </w:rPr>
+        <w:t xml:space="preserve"> :...</w:t>
+      </w:r>
+      <w:proofErr w:type="gramEnd"/>
+      <w:r>
+        <w:rPr>
+          <w:rFonts w:ascii="Cambria" w:hAnsi="Cambria" w:hint="cs"/>
+          <w:sz w:val="28"/>
+          <w:szCs w:val="28"/>
+          <w:rtl/>
+          <w:lang w:bidi="ar-DZ"/>
+        </w:rPr>
+        <w:t>../ المؤرخ :....../......./..........</w:t>
       </w:r>
     </w:p>
     <w:p>
@@ -314,7 +336,20 @@
           <w:rtl/>
           <w:lang w:bidi="ar-DZ"/>
         </w:rPr>
-        <w:t xml:space="preserve">         </w:t>
+        <w:t xml:space="preserve">        </w:t>
+      </w:r>
+      <w:proofErr w:type="gramStart"/>
+      <w:r>
+        <w:rPr>
+          <w:rFonts w:ascii="Arial" w:hAnsi="Arial" w:cs="Arial"/>
+          <w:b/>
+          <w:bCs/>
+          <w:sz w:val="24"/>
+          <w:szCs w:val="24"/>
+          <w:rtl/>
+          <w:lang w:bidi="ar-DZ"/>
+        </w:rPr>
+        <w:t xml:space="preserve"> </w:t>
       </w:r>
       <w:r>
         <w:rPr>
@@ -338,7 +373,20 @@
           <w:rtl/>
           <w:lang w:bidi="ar-DZ"/>
         </w:rPr>
-        <w:t>(1)المستورد</w:t>
+        <w:t>(</w:t>
+      </w:r>
+      <w:proofErr w:type="gramEnd"/>
+      <w:r>
+        <w:rPr>
+          <w:rFonts w:ascii="Arial" w:hAnsi="Arial" w:cs="Arial" w:hint="cs"/>
+          <w:b/>
+          <w:bCs/>
+          <w:sz w:val="24"/>
+          <w:szCs w:val="24"/>
+          <w:rtl/>
+          <w:lang w:bidi="ar-DZ"/>
+        </w:rPr>
+        <w:t>1)المستورد</w:t>
       </w:r>
       <w:r>
         <w:rPr>
@@ -428,6 +476,7 @@
         </w:rPr>
         <w:t xml:space="preserve">  رقم وتاريخ س </w:t>
       </w:r>
+      <w:proofErr w:type="gramStart"/>
       <w:r>
         <w:rPr>
           <w:rFonts w:ascii="Arial" w:hAnsi="Arial" w:cs="Arial" w:hint="cs"/>
@@ -450,7 +499,20 @@
           <w:rtl/>
           <w:lang w:bidi="ar-DZ"/>
         </w:rPr>
-        <w:t>{{رقم_س_ت}}</w:t>
+        <w:t>{</w:t>
+      </w:r>
+      <w:proofErr w:type="gramEnd"/>
+      <w:r>
+        <w:rPr>
+          <w:rFonts w:ascii="Arial" w:hAnsi="Arial" w:cs="Arial" w:hint="cs"/>
+          <w:b/>
+          <w:bCs/>
+          <w:sz w:val="24"/>
+          <w:szCs w:val="24"/>
+          <w:rtl/>
+          <w:lang w:bidi="ar-DZ"/>
+        </w:rPr>
+        <w:t>{رقم_س_ت}}</w:t>
       </w:r>
       <w:r>
         <w:rPr>
@@ -648,19 +710,45 @@
           <w:rtl/>
           <w:lang w:bidi="ar-DZ"/>
         </w:rPr>
-        <w:t xml:space="preserve">     </w:t>
-      </w:r>
-      <w:r>
-        <w:rPr>
-          <w:rFonts w:ascii="Arial" w:hAnsi="Arial" w:cs="Arial"/>
-          <w:b/>
-          <w:bCs/>
-          <w:sz w:val="24"/>
-          <w:szCs w:val="24"/>
-          <w:rtl/>
-          <w:lang w:bidi="ar-DZ"/>
-        </w:rPr>
-        <w:t xml:space="preserve">  (2)العنوان:</w:t>
+        <w:t xml:space="preserve">    </w:t>
+      </w:r>
+      <w:proofErr w:type="gramStart"/>
+      <w:r>
+        <w:rPr>
+          <w:rFonts w:ascii="Arial" w:hAnsi="Arial" w:cs="Arial" w:hint="cs"/>
+          <w:b/>
+          <w:bCs/>
+          <w:sz w:val="24"/>
+          <w:szCs w:val="24"/>
+          <w:rtl/>
+          <w:lang w:bidi="ar-DZ"/>
+        </w:rPr>
+        <w:t xml:space="preserve"> </w:t>
+      </w:r>
+      <w:r>
+        <w:rPr>
+          <w:rFonts w:ascii="Arial" w:hAnsi="Arial" w:cs="Arial"/>
+          <w:b/>
+          <w:bCs/>
+          <w:sz w:val="24"/>
+          <w:szCs w:val="24"/>
+          <w:rtl/>
+          <w:lang w:bidi="ar-DZ"/>
+        </w:rPr>
+        <w:t xml:space="preserve">  (</w:t>
+      </w:r>
+      <w:proofErr w:type="gramEnd"/>
+      <w:r>
+        <w:rPr>
+          <w:rFonts w:ascii="Arial" w:hAnsi="Arial" w:cs="Arial"/>
+          <w:b/>
+          <w:bCs/>
+          <w:sz w:val="24"/>
+          <w:szCs w:val="24"/>
+          <w:rtl/>
+          <w:lang w:bidi="ar-DZ"/>
+        </w:rPr>
+        <w:t>2)العنوان:</w:t>
       </w:r>
       <w:r>
         <w:rPr>
@@ -726,17 +814,31 @@
         </w:rPr>
         <w:t xml:space="preserve">           </w:t>
       </w:r>
-      <w:r>
-        <w:rPr>
-          <w:rFonts w:ascii="Arial" w:hAnsi="Arial" w:cs="Arial"/>
-          <w:b/>
-          <w:bCs/>
-          <w:sz w:val="24"/>
-          <w:szCs w:val="24"/>
-          <w:rtl/>
-          <w:lang w:bidi="ar-DZ"/>
-        </w:rPr>
-        <w:t xml:space="preserve">   (3)تعيين المنتوج:</w:t>
+      <w:proofErr w:type="gramStart"/>
+      <w:r>
+        <w:rPr>
+          <w:rFonts w:ascii="Arial" w:hAnsi="Arial" w:cs="Arial"/>
+          <w:b/>
+          <w:bCs/>
+          <w:sz w:val="24"/>
+          <w:szCs w:val="24"/>
+          <w:rtl/>
+          <w:lang w:bidi="ar-DZ"/>
+        </w:rPr>
+        <w:t xml:space="preserve">   (</w:t>
+      </w:r>
+      <w:proofErr w:type="gramEnd"/>
+      <w:r>
+        <w:rPr>
+          <w:rFonts w:ascii="Arial" w:hAnsi="Arial" w:cs="Arial"/>
+          <w:b/>
+          <w:bCs/>
+          <w:sz w:val="24"/>
+          <w:szCs w:val="24"/>
+          <w:rtl/>
+          <w:lang w:bidi="ar-DZ"/>
+        </w:rPr>
+        <w:t>3)تعيين المنتوج:</w:t>
       </w:r>
       <w:r>
         <w:rPr>
@@ -816,6 +918,7 @@
         </w:rPr>
         <w:t xml:space="preserve">           </w:t>
       </w:r>
+      <w:proofErr w:type="gramStart"/>
       <w:r>
         <w:rPr>
           <w:rFonts w:ascii="Arial" w:hAnsi="Arial" w:cs="Arial"/>
@@ -838,7 +941,20 @@
           <w:rtl/>
           <w:lang w:bidi="ar-DZ"/>
         </w:rPr>
-        <w:t xml:space="preserve">  (4)معروض في: </w:t>
+        <w:t xml:space="preserve">  (</w:t>
+      </w:r>
+      <w:proofErr w:type="gramEnd"/>
+      <w:r>
+        <w:rPr>
+          <w:rFonts w:ascii="Arial" w:hAnsi="Arial" w:cs="Arial"/>
+          <w:b/>
+          <w:bCs/>
+          <w:sz w:val="24"/>
+          <w:szCs w:val="24"/>
+          <w:rtl/>
+          <w:lang w:bidi="ar-DZ"/>
+        </w:rPr>
+        <w:t xml:space="preserve">4)معروض في: </w:t>
       </w:r>
       <w:r>
         <w:rPr>
@@ -1040,17 +1156,31 @@
         </w:rPr>
         <w:t xml:space="preserve">   </w:t>
       </w:r>
-      <w:r>
-        <w:rPr>
-          <w:rFonts w:ascii="Arial" w:hAnsi="Arial" w:cs="Arial"/>
-          <w:b/>
-          <w:bCs/>
-          <w:sz w:val="24"/>
-          <w:szCs w:val="24"/>
-          <w:rtl/>
-          <w:lang w:bidi="ar-DZ"/>
-        </w:rPr>
-        <w:t xml:space="preserve">   (6)الكمية:</w:t>
+      <w:proofErr w:type="gramStart"/>
+      <w:r>
+        <w:rPr>
+          <w:rFonts w:ascii="Arial" w:hAnsi="Arial" w:cs="Arial"/>
+          <w:b/>
+          <w:bCs/>
+          <w:sz w:val="24"/>
+          <w:szCs w:val="24"/>
+          <w:rtl/>
+          <w:lang w:bidi="ar-DZ"/>
+        </w:rPr>
+        <w:t xml:space="preserve">   (</w:t>
+      </w:r>
+      <w:proofErr w:type="gramEnd"/>
+      <w:r>
+        <w:rPr>
+          <w:rFonts w:ascii="Arial" w:hAnsi="Arial" w:cs="Arial"/>
+          <w:b/>
+          <w:bCs/>
+          <w:sz w:val="24"/>
+          <w:szCs w:val="24"/>
+          <w:rtl/>
+          <w:lang w:bidi="ar-DZ"/>
+        </w:rPr>
+        <w:t>6)الكمية:</w:t>
       </w:r>
       <w:r>
         <w:rPr>
@@ -1222,6 +1352,7 @@
         </w:rPr>
         <w:t xml:space="preserve">     </w:t>
       </w:r>
+      <w:proofErr w:type="gramStart"/>
       <w:r>
         <w:rPr>
           <w:rFonts w:ascii="Arial" w:hAnsi="Arial" w:cs="Arial" w:hint="cs"/>
@@ -1244,7 +1375,20 @@
           <w:rtl/>
           <w:lang w:bidi="ar-DZ"/>
         </w:rPr>
-        <w:t>(8)فاتورة الشراء</w:t>
+        <w:t>(</w:t>
+      </w:r>
+      <w:proofErr w:type="gramEnd"/>
+      <w:r>
+        <w:rPr>
+          <w:rFonts w:ascii="Arial" w:hAnsi="Arial" w:cs="Arial"/>
+          <w:b/>
+          <w:bCs/>
+          <w:sz w:val="24"/>
+          <w:szCs w:val="24"/>
+          <w:rtl/>
+          <w:lang w:bidi="ar-DZ"/>
+        </w:rPr>
+        <w:t>8)فاتورة الشراء</w:t>
       </w:r>
       <w:r>
         <w:rPr>
@@ -1434,6 +1578,166 @@
       </w:pPr>
       <w:r>
         <w:rPr>
+          <w:rFonts w:ascii="Arial" w:hAnsi="Arial" w:cs="Arial"/>
+          <w:b/>
+          <w:bCs/>
+          <w:sz w:val="24"/>
+          <w:szCs w:val="24"/>
+          <w:lang w:bidi="ar-DZ"/>
+        </w:rPr>
+        <w:t xml:space="preserve">              </w:t>
+      </w:r>
+      <w:proofErr w:type="gramStart"/>
+      <w:r>
+        <w:rPr>
+          <w:rFonts w:ascii="Arial" w:hAnsi="Arial" w:cs="Arial"/>
+          <w:b/>
+          <w:bCs/>
+          <w:sz w:val="24"/>
+          <w:szCs w:val="24"/>
+          <w:lang w:val="en-US" w:bidi="ar-DZ"/>
+        </w:rPr>
+        <w:t xml:space="preserve">{{ </w:t>
+      </w:r>
+      <w:proofErr w:type="spellStart"/>
+      <w:r>
+        <w:rPr>
+          <w:rFonts w:ascii="Arial" w:hAnsi="Arial" w:cs="Arial"/>
+          <w:b/>
+          <w:bCs/>
+          <w:sz w:val="24"/>
+          <w:szCs w:val="24"/>
+          <w:lang w:val="en-US" w:bidi="ar-DZ"/>
+        </w:rPr>
+        <w:t>القيمة</w:t>
+      </w:r>
+      <w:proofErr w:type="gramEnd"/>
+      <w:r>
+        <w:rPr>
+          <w:rFonts w:ascii="Arial" w:hAnsi="Arial" w:cs="Arial"/>
+          <w:b/>
+          <w:bCs/>
+          <w:sz w:val="24"/>
+          <w:szCs w:val="24"/>
+          <w:lang w:val="en-US" w:bidi="ar-DZ"/>
+        </w:rPr>
+        <w:t>_بالدينار</w:t>
+      </w:r>
+      <w:proofErr w:type="spellEnd"/>
+      <w:r>
+        <w:rPr>
+          <w:rFonts w:ascii="Arial" w:hAnsi="Arial" w:cs="Arial"/>
+          <w:b/>
+          <w:bCs/>
+          <w:sz w:val="24"/>
+          <w:szCs w:val="24"/>
+          <w:lang w:val="en-US" w:bidi="ar-DZ"/>
+        </w:rPr>
+        <w:t xml:space="preserve"> }}</w:t>
+      </w:r>
+      <w:r>
+        <w:rPr>
+          <w:rFonts w:ascii="Arial" w:hAnsi="Arial" w:cs="Arial"/>
+          <w:b/>
+          <w:bCs/>
+          <w:sz w:val="24"/>
+          <w:szCs w:val="24"/>
+          <w:lang w:val="en-US" w:bidi="ar-DZ"/>
+        </w:rPr>
+        <w:t xml:space="preserve">  </w:t>
+      </w:r>
+      <w:r>
+        <w:rPr>
+          <w:rFonts w:ascii="Arial" w:hAnsi="Arial" w:cs="Arial"/>
+          <w:b/>
+          <w:bCs/>
+          <w:sz w:val="24"/>
+          <w:szCs w:val="24"/>
+          <w:lang w:val="en-US" w:bidi="ar-DZ"/>
+        </w:rPr>
+        <w:t xml:space="preserve"> </w:t>
+      </w:r>
+      <w:r>
+        <w:rPr>
+          <w:rFonts w:ascii="Arial" w:hAnsi="Arial" w:cs="Arial"/>
+          <w:b/>
+          <w:bCs/>
+          <w:sz w:val="24"/>
+          <w:szCs w:val="24"/>
+          <w:lang w:val="en-US" w:bidi="ar-DZ"/>
+        </w:rPr>
+        <w:t xml:space="preserve">  </w:t>
+      </w:r>
+      <w:r>
+        <w:rPr>
+          <w:rFonts w:ascii="Arial" w:hAnsi="Arial" w:cs="Arial"/>
+          <w:b/>
+          <w:bCs/>
+          <w:sz w:val="24"/>
+          <w:szCs w:val="24"/>
+          <w:lang w:val="en-US" w:bidi="ar-DZ"/>
+        </w:rPr>
+        <w:t xml:space="preserve">               {{ </w:t>
+      </w:r>
+      <w:r>
+        <w:rPr>
+          <w:rFonts w:ascii="Arial" w:hAnsi="Arial" w:cs="Arial" w:hint="cs"/>
+          <w:b/>
+          <w:bCs/>
+          <w:sz w:val="24"/>
+          <w:szCs w:val="24"/>
+          <w:rtl/>
+          <w:lang w:val="en-US" w:bidi="ar-DZ"/>
+        </w:rPr>
+        <w:t>الفاتورة</w:t>
+      </w:r>
+      <w:r>
+        <w:rPr>
+          <w:rFonts w:ascii="Arial" w:hAnsi="Arial" w:cs="Arial"/>
+          <w:b/>
+          <w:bCs/>
+          <w:sz w:val="24"/>
+          <w:szCs w:val="24"/>
+          <w:lang w:val="en-US" w:bidi="ar-DZ"/>
+        </w:rPr>
+        <w:t>_</w:t>
+      </w:r>
+      <w:r>
+        <w:rPr>
+          <w:rFonts w:ascii="Arial" w:hAnsi="Arial" w:cs="Arial" w:hint="cs"/>
+          <w:b/>
+          <w:bCs/>
+          <w:sz w:val="24"/>
+          <w:szCs w:val="24"/>
+          <w:rtl/>
+          <w:lang w:val="en-US" w:bidi="ar-DZ"/>
+        </w:rPr>
+        <w:t>تاريخ</w:t>
+      </w:r>
+      <w:r>
+        <w:rPr>
+          <w:rFonts w:ascii="Arial" w:hAnsi="Arial" w:cs="Arial"/>
+          <w:b/>
+          <w:bCs/>
+          <w:sz w:val="24"/>
+          <w:szCs w:val="24"/>
+          <w:lang w:val="en-US" w:bidi="ar-DZ"/>
+        </w:rPr>
+        <w:t xml:space="preserve">}}   </w:t>
+      </w:r>
+      <w:r>
+        <w:rPr>
+          <w:rFonts w:ascii="Arial" w:hAnsi="Arial" w:cs="Arial"/>
+          <w:b/>
+          <w:bCs/>
+          <w:sz w:val="24"/>
+          <w:szCs w:val="24"/>
+          <w:lang w:val="en-US" w:bidi="ar-DZ"/>
+        </w:rPr>
+        <w:t xml:space="preserve"> </w:t>
+      </w:r>
+      <w:r>
+        <w:rPr>
           <w:rFonts w:ascii="Arial" w:hAnsi="Arial" w:cs="Arial" w:hint="cs"/>
           <w:b/>
           <w:bCs/>
@@ -1466,151 +1770,6 @@
           <w:lang w:val="en-US" w:bidi="ar-DZ"/>
         </w:rPr>
         <w:t xml:space="preserve"> </w:t>
-      </w:r>
-      <w:r>
-        <w:rPr>
-          <w:rFonts w:ascii="Arial" w:hAnsi="Arial" w:cs="Arial"/>
-          <w:b/>
-          <w:bCs/>
-          <w:sz w:val="24"/>
-          <w:szCs w:val="24"/>
-          <w:lang w:val="en-US" w:bidi="ar-DZ"/>
-        </w:rPr>
-        <w:t xml:space="preserve">               {{ </w:t>
-      </w:r>
-      <w:r>
-        <w:rPr>
-          <w:rFonts w:ascii="Arial" w:hAnsi="Arial" w:cs="Arial" w:hint="cs"/>
-          <w:b/>
-          <w:bCs/>
-          <w:sz w:val="24"/>
-          <w:szCs w:val="24"/>
-          <w:rtl/>
-          <w:lang w:val="en-US" w:bidi="ar-DZ"/>
-        </w:rPr>
-        <w:t>الفاتورة</w:t>
-      </w:r>
-      <w:r>
-        <w:rPr>
-          <w:rFonts w:ascii="Arial" w:hAnsi="Arial" w:cs="Arial"/>
-          <w:b/>
-          <w:bCs/>
-          <w:sz w:val="24"/>
-          <w:szCs w:val="24"/>
-          <w:lang w:val="en-US" w:bidi="ar-DZ"/>
-        </w:rPr>
-        <w:t>_</w:t>
-      </w:r>
-      <w:r>
-        <w:rPr>
-          <w:rFonts w:ascii="Arial" w:hAnsi="Arial" w:cs="Arial" w:hint="cs"/>
-          <w:b/>
-          <w:bCs/>
-          <w:sz w:val="24"/>
-          <w:szCs w:val="24"/>
-          <w:rtl/>
-          <w:lang w:val="en-US" w:bidi="ar-DZ"/>
-        </w:rPr>
-        <w:t>تاريخ</w:t>
-      </w:r>
-      <w:r>
-        <w:rPr>
-          <w:rFonts w:ascii="Arial" w:hAnsi="Arial" w:cs="Arial"/>
-          <w:b/>
-          <w:bCs/>
-          <w:sz w:val="24"/>
-          <w:szCs w:val="24"/>
-          <w:lang w:val="en-US" w:bidi="ar-DZ"/>
-        </w:rPr>
-        <w:t xml:space="preserve">}}   </w:t>
-      </w:r>
-      <w:r>
-        <w:rPr>
-          <w:rFonts w:ascii="Arial" w:hAnsi="Arial" w:cs="Arial"/>
-          <w:b/>
-          <w:bCs/>
-          <w:sz w:val="24"/>
-          <w:szCs w:val="24"/>
-          <w:lang w:bidi="ar-DZ"/>
-        </w:rPr>
-        <w:t xml:space="preserve">              </w:t>
-      </w:r>
-      <w:r>
-        <w:rPr>
-          <w:rFonts w:ascii="Arial" w:hAnsi="Arial" w:cs="Arial"/>
-          <w:b/>
-          <w:bCs/>
-          <w:sz w:val="24"/>
-          <w:szCs w:val="24"/>
-          <w:lang w:val="en-US" w:bidi="ar-DZ"/>
-        </w:rPr>
-        <w:t xml:space="preserve">  </w:t>
-      </w:r>
-      <w:r>
-        <w:rPr>
-          <w:rFonts w:ascii="Arial" w:hAnsi="Arial" w:cs="Arial"/>
-          <w:b/>
-          <w:bCs/>
-          <w:sz w:val="24"/>
-          <w:szCs w:val="24"/>
-          <w:lang w:val="en-US" w:bidi="ar-DZ"/>
-        </w:rPr>
-        <w:t xml:space="preserve"> </w:t>
-      </w:r>
-      <w:r>
-        <w:rPr>
-          <w:rFonts w:ascii="Arial" w:hAnsi="Arial" w:cs="Arial"/>
-          <w:b/>
-          <w:bCs/>
-          <w:sz w:val="24"/>
-          <w:szCs w:val="24"/>
-          <w:lang w:val="en-US" w:bidi="ar-DZ"/>
-        </w:rPr>
-        <w:t xml:space="preserve">  </w:t>
-      </w:r>
-      <w:r>
-        <w:rPr>
-          <w:rFonts w:ascii="Arial" w:hAnsi="Arial" w:cs="Arial"/>
-          <w:b/>
-          <w:bCs/>
-          <w:sz w:val="24"/>
-          <w:szCs w:val="24"/>
-          <w:lang w:val="en-US" w:bidi="ar-DZ"/>
-        </w:rPr>
-        <w:t xml:space="preserve"> </w:t>
-      </w:r>
-      <w:r>
-        <w:rPr>
-          <w:rFonts w:ascii="Arial" w:hAnsi="Arial" w:cs="Arial"/>
-          <w:b/>
-          <w:bCs/>
-          <w:sz w:val="24"/>
-          <w:szCs w:val="24"/>
-          <w:lang w:val="en-US" w:bidi="ar-DZ"/>
-        </w:rPr>
-        <w:t xml:space="preserve">{{ </w:t>
-      </w:r>
-      <w:r>
-        <w:rPr>
-          <w:rFonts w:ascii="Arial" w:hAnsi="Arial" w:cs="Arial"/>
-          <w:b/>
-          <w:bCs/>
-          <w:sz w:val="24"/>
-          <w:szCs w:val="24"/>
-          <w:lang w:val="en-US" w:bidi="ar-DZ"/>
-        </w:rPr>
-        <w:t>القيمة_بالدينار</w:t>
-      </w:r>
-      <w:r>
-        <w:rPr>
-          <w:rFonts w:ascii="Arial" w:hAnsi="Arial" w:cs="Arial"/>
-          <w:b/>
-          <w:bCs/>
-          <w:sz w:val="24"/>
-          <w:szCs w:val="24"/>
-          <w:lang w:val="en-US" w:bidi="ar-DZ"/>
-        </w:rPr>
-        <w:t xml:space="preserve"> }}</w:t>
       </w:r>
     </w:p>
     <w:p>
@@ -1629,6 +1788,7 @@
           <w:lang w:val="en-US" w:bidi="ar-DZ"/>
         </w:rPr>
       </w:pPr>
+      <w:proofErr w:type="gramStart"/>
       <w:r>
         <w:rPr>
           <w:rFonts w:ascii="Cambria" w:hAnsi="Cambria"/>
@@ -1649,6 +1809,7 @@
         <w:t>الصانع</w:t>
       </w:r>
       <w:proofErr w:type="spellEnd"/>
+      <w:proofErr w:type="gramEnd"/>
       <w:r>
         <w:rPr>
           <w:rFonts w:ascii="Cambria" w:hAnsi="Cambria"/>
@@ -1800,19 +1961,45 @@
           <w:rtl/>
           <w:lang w:bidi="ar-DZ"/>
         </w:rPr>
-        <w:t xml:space="preserve">   </w:t>
-      </w:r>
-      <w:r>
-        <w:rPr>
-          <w:rFonts w:ascii="Arial" w:hAnsi="Arial" w:cs="Arial"/>
-          <w:b/>
-          <w:bCs/>
-          <w:sz w:val="24"/>
-          <w:szCs w:val="24"/>
-          <w:rtl/>
-          <w:lang w:bidi="ar-DZ"/>
-        </w:rPr>
-        <w:t xml:space="preserve"> (11) مكان المصدر :</w:t>
+        <w:t xml:space="preserve"> </w:t>
+      </w:r>
+      <w:proofErr w:type="gramStart"/>
+      <w:r>
+        <w:rPr>
+          <w:rFonts w:ascii="Arial" w:hAnsi="Arial" w:cs="Arial"/>
+          <w:b/>
+          <w:bCs/>
+          <w:sz w:val="24"/>
+          <w:szCs w:val="24"/>
+          <w:rtl/>
+          <w:lang w:bidi="ar-DZ"/>
+        </w:rPr>
+        <w:t xml:space="preserve">  </w:t>
+      </w:r>
+      <w:r>
+        <w:rPr>
+          <w:rFonts w:ascii="Arial" w:hAnsi="Arial" w:cs="Arial"/>
+          <w:b/>
+          <w:bCs/>
+          <w:sz w:val="24"/>
+          <w:szCs w:val="24"/>
+          <w:rtl/>
+          <w:lang w:bidi="ar-DZ"/>
+        </w:rPr>
+        <w:t xml:space="preserve"> (</w:t>
+      </w:r>
+      <w:proofErr w:type="gramEnd"/>
+      <w:r>
+        <w:rPr>
+          <w:rFonts w:ascii="Arial" w:hAnsi="Arial" w:cs="Arial"/>
+          <w:b/>
+          <w:bCs/>
+          <w:sz w:val="24"/>
+          <w:szCs w:val="24"/>
+          <w:rtl/>
+          <w:lang w:bidi="ar-DZ"/>
+        </w:rPr>
+        <w:t>11) مكان المصدر :</w:t>
       </w:r>
       <w:r>
         <w:rPr>
@@ -1904,6 +2091,7 @@
         </w:rPr>
         <w:t xml:space="preserve">       </w:t>
       </w:r>
+      <w:proofErr w:type="gramStart"/>
       <w:r>
         <w:rPr>
           <w:rFonts w:ascii="Arial" w:hAnsi="Arial" w:cs="Arial"/>
@@ -1926,7 +2114,20 @@
           <w:rtl/>
           <w:lang w:bidi="ar-DZ"/>
         </w:rPr>
-        <w:t xml:space="preserve"> (12) رقم </w:t>
+        <w:t xml:space="preserve"> (</w:t>
+      </w:r>
+      <w:proofErr w:type="gramEnd"/>
+      <w:r>
+        <w:rPr>
+          <w:rFonts w:ascii="Arial" w:hAnsi="Arial" w:cs="Arial"/>
+          <w:b/>
+          <w:bCs/>
+          <w:sz w:val="24"/>
+          <w:szCs w:val="24"/>
+          <w:rtl/>
+          <w:lang w:bidi="ar-DZ"/>
+        </w:rPr>
+        <w:t xml:space="preserve">12) رقم </w:t>
       </w:r>
       <w:r>
         <w:rPr>
@@ -2004,19 +2205,45 @@
           <w:rtl/>
           <w:lang w:bidi="ar-DZ"/>
         </w:rPr>
-        <w:t xml:space="preserve">    </w:t>
-      </w:r>
-      <w:r>
-        <w:rPr>
-          <w:rFonts w:ascii="Arial" w:hAnsi="Arial" w:cs="Arial"/>
-          <w:b/>
-          <w:bCs/>
-          <w:sz w:val="24"/>
-          <w:szCs w:val="24"/>
-          <w:rtl/>
-          <w:lang w:bidi="ar-DZ"/>
-        </w:rPr>
-        <w:t xml:space="preserve">  (13) اشهاد المنتوج :.....شهادة المنشأ</w:t>
+        <w:t xml:space="preserve">   </w:t>
+      </w:r>
+      <w:proofErr w:type="gramStart"/>
+      <w:r>
+        <w:rPr>
+          <w:rFonts w:ascii="Arial" w:hAnsi="Arial" w:cs="Arial"/>
+          <w:b/>
+          <w:bCs/>
+          <w:sz w:val="24"/>
+          <w:szCs w:val="24"/>
+          <w:rtl/>
+          <w:lang w:bidi="ar-DZ"/>
+        </w:rPr>
+        <w:t xml:space="preserve"> </w:t>
+      </w:r>
+      <w:r>
+        <w:rPr>
+          <w:rFonts w:ascii="Arial" w:hAnsi="Arial" w:cs="Arial"/>
+          <w:b/>
+          <w:bCs/>
+          <w:sz w:val="24"/>
+          <w:szCs w:val="24"/>
+          <w:rtl/>
+          <w:lang w:bidi="ar-DZ"/>
+        </w:rPr>
+        <w:t xml:space="preserve">  (</w:t>
+      </w:r>
+      <w:proofErr w:type="gramEnd"/>
+      <w:r>
+        <w:rPr>
+          <w:rFonts w:ascii="Arial" w:hAnsi="Arial" w:cs="Arial"/>
+          <w:b/>
+          <w:bCs/>
+          <w:sz w:val="24"/>
+          <w:szCs w:val="24"/>
+          <w:rtl/>
+          <w:lang w:bidi="ar-DZ"/>
+        </w:rPr>
+        <w:t>13) اشهاد المنتوج :.....شهادة المنشأ</w:t>
       </w:r>
       <w:r>
         <w:rPr>
@@ -2277,6 +2504,65 @@
           <w:lang w:bidi="ar-DZ"/>
         </w:rPr>
       </w:pPr>
+      <w:proofErr w:type="gramStart"/>
+      <w:r>
+        <w:rPr>
+          <w:rFonts w:ascii="Arial" w:hAnsi="Arial" w:cs="Arial"/>
+          <w:b/>
+          <w:bCs/>
+          <w:sz w:val="24"/>
+          <w:szCs w:val="24"/>
+          <w:lang w:bidi="ar-DZ"/>
+        </w:rPr>
+        <w:t xml:space="preserve">{{ </w:t>
+      </w:r>
+      <w:proofErr w:type="spellStart"/>
+      <w:r>
+        <w:rPr>
+          <w:rFonts w:ascii="Arial" w:hAnsi="Arial" w:cs="Arial"/>
+          <w:b/>
+          <w:bCs/>
+          <w:sz w:val="24"/>
+          <w:szCs w:val="24"/>
+          <w:lang w:bidi="ar-DZ"/>
+        </w:rPr>
+        <w:t>مرجع</w:t>
+      </w:r>
+      <w:proofErr w:type="gramEnd"/>
+      <w:r>
+        <w:rPr>
+          <w:rFonts w:ascii="Arial" w:hAnsi="Arial" w:cs="Arial"/>
+          <w:b/>
+          <w:bCs/>
+          <w:sz w:val="24"/>
+          <w:szCs w:val="24"/>
+          <w:lang w:bidi="ar-DZ"/>
+        </w:rPr>
+        <w:t>_النقل</w:t>
+      </w:r>
+      <w:proofErr w:type="spellEnd"/>
+      <w:r>
+        <w:rPr>
+          <w:rFonts w:ascii="Arial" w:hAnsi="Arial" w:cs="Arial"/>
+          <w:b/>
+          <w:bCs/>
+          <w:sz w:val="24"/>
+          <w:szCs w:val="24"/>
+          <w:lang w:bidi="ar-DZ"/>
+        </w:rPr>
+        <w:t xml:space="preserve"> }}</w:t>
+      </w:r>
+      <w:r>
+        <w:rPr>
+          <w:rFonts w:ascii="Arial" w:hAnsi="Arial" w:cs="Arial"/>
+          <w:b/>
+          <w:bCs/>
+          <w:sz w:val="24"/>
+          <w:szCs w:val="24"/>
+          <w:lang w:bidi="ar-DZ"/>
+        </w:rPr>
+        <w:t xml:space="preserve"> </w:t>
+      </w:r>
       <w:r>
         <w:rPr>
           <w:rFonts w:ascii="Arial" w:hAnsi="Arial" w:cs="Arial"/>
@@ -2336,62 +2622,6 @@
           <w:lang w:bidi="ar-DZ"/>
         </w:rPr>
         <w:t xml:space="preserve">  (14) مرجع النقل : </w:t>
-      </w:r>
-      <w:r>
-        <w:rPr>
-          <w:rFonts w:ascii="Arial" w:hAnsi="Arial" w:cs="Arial" w:hint="cs"/>
-          <w:b/>
-          <w:bCs/>
-          <w:sz w:val="24"/>
-          <w:szCs w:val="24"/>
-          <w:rtl/>
-          <w:lang w:bidi="ar-DZ"/>
-        </w:rPr>
-        <w:t xml:space="preserve"> </w:t>
-      </w:r>
-      <w:r>
-        <w:rPr>
-          <w:rFonts w:ascii="Arial" w:hAnsi="Arial" w:cs="Arial"/>
-          <w:b/>
-          <w:bCs/>
-          <w:sz w:val="24"/>
-          <w:szCs w:val="24"/>
-          <w:lang w:bidi="ar-DZ"/>
-        </w:rPr>
-        <w:t xml:space="preserve">  </w:t>
-      </w:r>
-      <w:r>
-        <w:rPr>
-          <w:rFonts w:ascii="Arial" w:hAnsi="Arial" w:cs="Arial"/>
-          <w:b/>
-          <w:bCs/>
-          <w:sz w:val="24"/>
-          <w:szCs w:val="24"/>
-          <w:lang w:bidi="ar-DZ"/>
-        </w:rPr>
-        <w:t xml:space="preserve">{{ </w:t>
-      </w:r>
-      <w:r>
-        <w:rPr>
-          <w:rFonts w:ascii="Arial" w:hAnsi="Arial" w:cs="Arial"/>
-          <w:b/>
-          <w:bCs/>
-          <w:sz w:val="24"/>
-          <w:szCs w:val="24"/>
-          <w:lang w:bidi="ar-DZ"/>
-        </w:rPr>
-        <w:t>مرجع_النقل</w:t>
-      </w:r>
-      <w:r>
-        <w:rPr>
-          <w:rFonts w:ascii="Arial" w:hAnsi="Arial" w:cs="Arial"/>
-          <w:b/>
-          <w:bCs/>
-          <w:sz w:val="24"/>
-          <w:szCs w:val="24"/>
-          <w:lang w:bidi="ar-DZ"/>
-        </w:rPr>
-        <w:t xml:space="preserve"> }}</w:t>
       </w:r>
     </w:p>
     <w:p>
@@ -2408,6 +2638,46 @@
           <w:lang w:bidi="ar-DZ"/>
         </w:rPr>
       </w:pPr>
+      <w:proofErr w:type="gramStart"/>
+      <w:r>
+        <w:rPr>
+          <w:rFonts w:ascii="Cambria" w:hAnsi="Cambria"/>
+          <w:b/>
+          <w:bCs/>
+          <w:lang w:bidi="ar-DZ"/>
+        </w:rPr>
+        <w:t xml:space="preserve">{{ </w:t>
+      </w:r>
+      <w:proofErr w:type="spellStart"/>
+      <w:r>
+        <w:rPr>
+          <w:rFonts w:ascii="Cambria" w:hAnsi="Cambria"/>
+          <w:b/>
+          <w:bCs/>
+          <w:lang w:bidi="ar-DZ"/>
+        </w:rPr>
+        <w:t>وثائق</w:t>
+      </w:r>
+      <w:proofErr w:type="gramEnd"/>
+      <w:r>
+        <w:rPr>
+          <w:rFonts w:ascii="Cambria" w:hAnsi="Cambria"/>
+          <w:b/>
+          <w:bCs/>
+          <w:lang w:bidi="ar-DZ"/>
+        </w:rPr>
+        <w:t>_النقل</w:t>
+      </w:r>
+      <w:proofErr w:type="spellEnd"/>
+      <w:r>
+        <w:rPr>
+          <w:rFonts w:ascii="Cambria" w:hAnsi="Cambria"/>
+          <w:b/>
+          <w:bCs/>
+          <w:lang w:bidi="ar-DZ"/>
+        </w:rPr>
+        <w:t xml:space="preserve"> }}</w:t>
+      </w:r>
       <w:r>
         <w:rPr>
           <w:rFonts w:ascii="Arial" w:hAnsi="Arial" w:cs="Arial"/>
@@ -2442,34 +2712,31 @@
           <w:rtl/>
           <w:lang w:bidi="ar-DZ"/>
         </w:rPr>
-        <w:t xml:space="preserve"> (15) وثائق النقل </w:t>
-      </w:r>
-      <w:r>
-        <w:rPr>
-          <w:rFonts w:ascii="Cambria" w:hAnsi="Cambria"/>
-          <w:b/>
-          <w:bCs/>
-          <w:lang w:bidi="ar-DZ"/>
-        </w:rPr>
-        <w:t xml:space="preserve">{{ </w:t>
-      </w:r>
-      <w:r>
-        <w:rPr>
-          <w:rFonts w:ascii="Cambria" w:hAnsi="Cambria"/>
-          <w:b/>
-          <w:bCs/>
-          <w:lang w:bidi="ar-DZ"/>
-        </w:rPr>
-        <w:t>وثائق_النقل</w:t>
-      </w:r>
-      <w:r>
-        <w:rPr>
-          <w:rFonts w:ascii="Cambria" w:hAnsi="Cambria"/>
-          <w:b/>
-          <w:bCs/>
-          <w:lang w:bidi="ar-DZ"/>
-        </w:rPr>
-        <w:t xml:space="preserve"> }}</w:t>
+        <w:t xml:space="preserve"> (15) وثائق النقل</w:t>
+      </w:r>
+      <w:r>
+        <w:rPr>
+          <w:rFonts w:ascii="Arial" w:hAnsi="Arial" w:cs="Arial" w:hint="cs"/>
+          <w:b/>
+          <w:bCs/>
+          <w:sz w:val="24"/>
+          <w:szCs w:val="24"/>
+          <w:rtl/>
+          <w:lang w:bidi="ar-DZ"/>
+        </w:rPr>
+        <w:t>:</w:t>
+      </w:r>
+      <w:r>
+        <w:rPr>
+          <w:rFonts w:ascii="Arial" w:hAnsi="Arial" w:cs="Arial"/>
+          <w:b/>
+          <w:bCs/>
+          <w:sz w:val="24"/>
+          <w:szCs w:val="24"/>
+          <w:rtl/>
+          <w:lang w:bidi="ar-DZ"/>
+        </w:rPr>
+        <w:t xml:space="preserve"> </w:t>
       </w:r>
     </w:p>
     <w:p>
@@ -2487,6 +2754,134 @@
       </w:pPr>
       <w:r>
         <w:rPr>
+          <w:rFonts w:ascii="Arial" w:hAnsi="Arial" w:cs="Arial" w:hint="cs"/>
+          <w:b/>
+          <w:bCs/>
+          <w:sz w:val="24"/>
+          <w:szCs w:val="24"/>
+          <w:rtl/>
+          <w:lang w:bidi="ar-DZ"/>
+        </w:rPr>
+        <w:t>بتاريخ</w:t>
+      </w:r>
+      <w:r>
+        <w:rPr>
+          <w:rFonts w:ascii="Arial" w:hAnsi="Arial" w:cs="Arial"/>
+          <w:b/>
+          <w:bCs/>
+          <w:sz w:val="24"/>
+          <w:szCs w:val="24"/>
+          <w:rtl/>
+          <w:lang w:bidi="ar-DZ"/>
+        </w:rPr>
+        <w:t>˸</w:t>
+      </w:r>
+      <w:r>
+        <w:rPr>
+          <w:rFonts w:ascii="Arial" w:hAnsi="Arial" w:cs="Arial" w:hint="cs"/>
+          <w:b/>
+          <w:bCs/>
+          <w:sz w:val="24"/>
+          <w:szCs w:val="24"/>
+          <w:rtl/>
+          <w:lang w:bidi="ar-DZ"/>
+        </w:rPr>
+        <w:t xml:space="preserve"> </w:t>
+      </w:r>
+      <w:proofErr w:type="gramStart"/>
+      <w:r>
+        <w:rPr>
+          <w:rFonts w:ascii="Arial" w:hAnsi="Arial" w:cs="Arial" w:hint="cs"/>
+          <w:b/>
+          <w:bCs/>
+          <w:sz w:val="24"/>
+          <w:szCs w:val="24"/>
+          <w:rtl/>
+          <w:lang w:bidi="ar-DZ"/>
+        </w:rPr>
+        <w:t xml:space="preserve">{{ </w:t>
+      </w:r>
+      <w:proofErr w:type="spellStart"/>
+      <w:r>
+        <w:rPr>
+          <w:rFonts w:ascii="Arial" w:hAnsi="Arial" w:cs="Arial" w:hint="cs"/>
+          <w:b/>
+          <w:bCs/>
+          <w:sz w:val="24"/>
+          <w:szCs w:val="24"/>
+          <w:rtl/>
+          <w:lang w:bidi="ar-DZ"/>
+        </w:rPr>
+        <w:t>تاريخ</w:t>
+      </w:r>
+      <w:proofErr w:type="gramEnd"/>
+      <w:r>
+        <w:rPr>
+          <w:rFonts w:ascii="Arial" w:hAnsi="Arial" w:cs="Arial" w:hint="cs"/>
+          <w:b/>
+          <w:bCs/>
+          <w:sz w:val="24"/>
+          <w:szCs w:val="24"/>
+          <w:rtl/>
+          <w:lang w:bidi="ar-DZ"/>
+        </w:rPr>
+        <w:t>_الانطلاق</w:t>
+      </w:r>
+      <w:proofErr w:type="spellEnd"/>
+      <w:r>
+        <w:rPr>
+          <w:rFonts w:ascii="Arial" w:hAnsi="Arial" w:cs="Arial" w:hint="cs"/>
+          <w:b/>
+          <w:bCs/>
+          <w:sz w:val="24"/>
+          <w:szCs w:val="24"/>
+          <w:rtl/>
+          <w:lang w:bidi="ar-DZ"/>
+        </w:rPr>
+        <w:t xml:space="preserve"> }}</w:t>
+      </w:r>
+      <w:r>
+        <w:rPr>
+          <w:rFonts w:ascii="Arial" w:hAnsi="Arial" w:cs="Arial"/>
+          <w:b/>
+          <w:bCs/>
+          <w:sz w:val="24"/>
+          <w:szCs w:val="24"/>
+          <w:lang w:bidi="ar-DZ"/>
+        </w:rPr>
+        <w:t xml:space="preserve"> </w:t>
+      </w:r>
+      <w:r>
+        <w:rPr>
+          <w:rFonts w:ascii="Cambria" w:hAnsi="Cambria"/>
+          <w:b/>
+          <w:bCs/>
+          <w:lang w:bidi="ar-DZ"/>
+        </w:rPr>
+        <w:t xml:space="preserve">{{ </w:t>
+      </w:r>
+      <w:proofErr w:type="spellStart"/>
+      <w:r>
+        <w:rPr>
+          <w:rFonts w:ascii="Cambria" w:hAnsi="Cambria"/>
+          <w:b/>
+          <w:bCs/>
+          <w:lang w:bidi="ar-DZ"/>
+        </w:rPr>
+        <w:t>الانطلاق_من</w:t>
+      </w:r>
+      <w:proofErr w:type="spellEnd"/>
+      <w:r>
+        <w:rPr>
+          <w:rFonts w:ascii="Cambria" w:hAnsi="Cambria"/>
+          <w:b/>
+          <w:bCs/>
+          <w:lang w:bidi="ar-DZ"/>
+        </w:rPr>
+        <w:t xml:space="preserve"> }}</w:t>
+      </w:r>
+      <w:r>
+        <w:rPr>
           <w:rFonts w:ascii="Arial" w:hAnsi="Arial" w:cs="Arial"/>
           <w:b/>
           <w:bCs/>
@@ -2544,116 +2939,6 @@
           <w:lang w:bidi="ar-DZ"/>
         </w:rPr>
         <w:t xml:space="preserve">(16)الانطلاق من :     </w:t>
-      </w:r>
-      <w:r>
-        <w:rPr>
-          <w:rFonts w:ascii="Cambria" w:hAnsi="Cambria"/>
-          <w:b/>
-          <w:bCs/>
-          <w:lang w:bidi="ar-DZ"/>
-        </w:rPr>
-        <w:t xml:space="preserve">{{ </w:t>
-      </w:r>
-      <w:r>
-        <w:rPr>
-          <w:rFonts w:ascii="Cambria" w:hAnsi="Cambria"/>
-          <w:b/>
-          <w:bCs/>
-          <w:lang w:bidi="ar-DZ"/>
-        </w:rPr>
-        <w:t>الانطلاق_من</w:t>
-      </w:r>
-      <w:r>
-        <w:rPr>
-          <w:rFonts w:ascii="Cambria" w:hAnsi="Cambria"/>
-          <w:b/>
-          <w:bCs/>
-          <w:lang w:bidi="ar-DZ"/>
-        </w:rPr>
-        <w:t xml:space="preserve"> }}</w:t>
-      </w:r>
-      <w:r>
-        <w:rPr>
-          <w:rFonts w:ascii="Arial" w:hAnsi="Arial" w:cs="Arial"/>
-          <w:b/>
-          <w:bCs/>
-          <w:sz w:val="24"/>
-          <w:szCs w:val="24"/>
-          <w:lang w:bidi="ar-DZ"/>
-        </w:rPr>
-        <w:t xml:space="preserve"> </w:t>
-      </w:r>
-      <w:r>
-        <w:rPr>
-          <w:rFonts w:ascii="Arial" w:hAnsi="Arial" w:cs="Arial" w:hint="cs"/>
-          <w:b/>
-          <w:bCs/>
-          <w:sz w:val="24"/>
-          <w:szCs w:val="24"/>
-          <w:rtl/>
-          <w:lang w:bidi="ar-DZ"/>
-        </w:rPr>
-        <w:t>بتاريخ</w:t>
-      </w:r>
-      <w:r>
-        <w:rPr>
-          <w:rFonts w:ascii="Arial" w:hAnsi="Arial" w:cs="Arial"/>
-          <w:b/>
-          <w:bCs/>
-          <w:sz w:val="24"/>
-          <w:szCs w:val="24"/>
-          <w:rtl/>
-          <w:lang w:bidi="ar-DZ"/>
-        </w:rPr>
-        <w:t>˸</w:t>
-      </w:r>
-      <w:r>
-        <w:rPr>
-          <w:rFonts w:ascii="Arial" w:hAnsi="Arial" w:cs="Arial" w:hint="cs"/>
-          <w:b/>
-          <w:bCs/>
-          <w:sz w:val="24"/>
-          <w:szCs w:val="24"/>
-          <w:rtl/>
-          <w:lang w:bidi="ar-DZ"/>
-        </w:rPr>
-        <w:t xml:space="preserve"> </w:t>
-      </w:r>
-      <w:r>
-        <w:rPr>
-          <w:rFonts w:ascii="Arial" w:hAnsi="Arial" w:cs="Arial" w:hint="cs"/>
-          <w:b/>
-          <w:bCs/>
-          <w:sz w:val="24"/>
-          <w:szCs w:val="24"/>
-          <w:rtl/>
-          <w:lang w:bidi="ar-DZ"/>
-        </w:rPr>
-        <w:t xml:space="preserve">{{ </w:t>
-      </w:r>
-      <w:r>
-        <w:rPr>
-          <w:rFonts w:ascii="Arial" w:hAnsi="Arial" w:cs="Arial" w:hint="cs"/>
-          <w:b/>
-          <w:bCs/>
-          <w:sz w:val="24"/>
-          <w:szCs w:val="24"/>
-          <w:rtl/>
-          <w:lang w:bidi="ar-DZ"/>
-        </w:rPr>
-        <w:t>تاريخ_الانطلاق</w:t>
-      </w:r>
-      <w:r>
-        <w:rPr>
-          <w:rFonts w:ascii="Arial" w:hAnsi="Arial" w:cs="Arial" w:hint="cs"/>
-          <w:b/>
-          <w:bCs/>
-          <w:sz w:val="24"/>
-          <w:szCs w:val="24"/>
-          <w:rtl/>
-          <w:lang w:bidi="ar-DZ"/>
-        </w:rPr>
-        <w:t xml:space="preserve"> }}</w:t>
       </w:r>
     </w:p>
     <w:p>
@@ -2693,19 +2978,45 @@
           <w:rtl/>
           <w:lang w:bidi="ar-DZ"/>
         </w:rPr>
-        <w:t xml:space="preserve">تاريخ                       </w:t>
-      </w:r>
-      <w:r>
-        <w:rPr>
-          <w:rFonts w:ascii="Arial" w:hAnsi="Arial" w:cs="Arial"/>
-          <w:b/>
-          <w:bCs/>
-          <w:sz w:val="24"/>
-          <w:szCs w:val="24"/>
-          <w:rtl/>
-          <w:lang w:bidi="ar-DZ"/>
-        </w:rPr>
-        <w:t xml:space="preserve">(16) العبور : </w:t>
+        <w:t xml:space="preserve">تاريخ                    </w:t>
+      </w:r>
+      <w:proofErr w:type="gramStart"/>
+      <w:r>
+        <w:rPr>
+          <w:rFonts w:ascii="Arial" w:hAnsi="Arial" w:cs="Arial"/>
+          <w:b/>
+          <w:bCs/>
+          <w:sz w:val="24"/>
+          <w:szCs w:val="24"/>
+          <w:rtl/>
+          <w:lang w:bidi="ar-DZ"/>
+        </w:rPr>
+        <w:t xml:space="preserve">   </w:t>
+      </w:r>
+      <w:r>
+        <w:rPr>
+          <w:rFonts w:ascii="Arial" w:hAnsi="Arial" w:cs="Arial"/>
+          <w:b/>
+          <w:bCs/>
+          <w:sz w:val="24"/>
+          <w:szCs w:val="24"/>
+          <w:rtl/>
+          <w:lang w:bidi="ar-DZ"/>
+        </w:rPr>
+        <w:t>(</w:t>
+      </w:r>
+      <w:proofErr w:type="gramEnd"/>
+      <w:r>
+        <w:rPr>
+          <w:rFonts w:ascii="Arial" w:hAnsi="Arial" w:cs="Arial"/>
+          <w:b/>
+          <w:bCs/>
+          <w:sz w:val="24"/>
+          <w:szCs w:val="24"/>
+          <w:rtl/>
+          <w:lang w:bidi="ar-DZ"/>
+        </w:rPr>
+        <w:t xml:space="preserve">16) العبور : </w:t>
       </w:r>
       <w:r>
         <w:rPr>
@@ -2795,6 +3106,7 @@
         </w:rPr>
         <w:t xml:space="preserve">                            </w:t>
       </w:r>
+      <w:proofErr w:type="gramStart"/>
       <w:r>
         <w:rPr>
           <w:rFonts w:ascii="Arial" w:hAnsi="Arial" w:cs="Arial"/>
@@ -2818,7 +3130,20 @@
           <w:rtl/>
           <w:lang w:bidi="ar-DZ"/>
         </w:rPr>
-        <w:t xml:space="preserve">:  /   /         </w:t>
+        <w:t>:  /</w:t>
+      </w:r>
+      <w:proofErr w:type="gramEnd"/>
+      <w:r>
+        <w:rPr>
+          <w:rFonts w:ascii="Arial" w:hAnsi="Arial" w:cs="Arial"/>
+          <w:b/>
+          <w:bCs/>
+          <w:sz w:val="24"/>
+          <w:szCs w:val="24"/>
+          <w:rtl/>
+          <w:lang w:bidi="ar-DZ"/>
+        </w:rPr>
+        <w:t xml:space="preserve">   /         </w:t>
       </w:r>
       <w:r>
         <w:rPr>

</xml_diff>

<commit_message>
Adding changes of check box + DCP
</commit_message>
<xml_diff>
--- a/frontend/api/templates/DCP.docx
+++ b/frontend/api/templates/DCP.docx
@@ -422,6 +422,18 @@
           <w:rtl/>
           <w:lang w:bidi="ar-DZ"/>
         </w:rPr>
+        <w:t xml:space="preserve"> </w:t>
+      </w:r>
+      <w:r>
+        <w:rPr>
+          <w:rFonts w:ascii="Arial" w:hAnsi="Arial" w:cs="Arial" w:hint="cs"/>
+          <w:b/>
+          <w:bCs/>
+          <w:sz w:val="24"/>
+          <w:szCs w:val="24"/>
+          <w:rtl/>
+          <w:lang w:bidi="ar-DZ"/>
+        </w:rPr>
         <w:t>{{ المستورد }}</w:t>
       </w:r>
     </w:p>
@@ -1016,7 +1028,7 @@
           <w:rtl/>
           <w:lang w:bidi="ar-DZ"/>
         </w:rPr>
-        <w:t xml:space="preserve">  </w:t>
+        <w:t xml:space="preserve"> </w:t>
       </w:r>
       <w:r>
         <w:rPr>
@@ -1054,7 +1066,19 @@
           <w:rtl/>
           <w:lang w:bidi="ar-DZ"/>
         </w:rPr>
-        <w:t xml:space="preserve"> }}</w:t>
+        <w:t>}</w:t>
+      </w:r>
+      <w:r>
+        <w:rPr>
+          <w:rFonts w:ascii="Arial" w:hAnsi="Arial" w:cs="Arial" w:hint="cs"/>
+          <w:b/>
+          <w:bCs/>
+          <w:sz w:val="24"/>
+          <w:szCs w:val="24"/>
+          <w:rtl/>
+          <w:lang w:bidi="ar-DZ"/>
+        </w:rPr>
+        <w:t>}</w:t>
       </w:r>
     </w:p>
     <w:p>
@@ -2489,6 +2513,7 @@
     <w:p>
       <w:pPr>
         <w:tabs>
+          <w:tab w:val="left" w:pos="528"/>
           <w:tab w:val="left" w:pos="2400"/>
           <w:tab w:val="left" w:pos="4212"/>
           <w:tab w:val="right" w:pos="9498"/>
@@ -2517,53 +2542,105 @@
         </w:rPr>
         <w:tab/>
       </w:r>
+      <w:r>
+        <w:rPr>
+          <w:rFonts w:ascii="Arial" w:hAnsi="Arial" w:cs="Arial" w:hint="cs"/>
+          <w:b/>
+          <w:bCs/>
+          <w:sz w:val="24"/>
+          <w:szCs w:val="24"/>
+          <w:rtl/>
+          <w:lang w:bidi="ar-DZ"/>
+        </w:rPr>
+        <w:t>{{</w:t>
+      </w:r>
+      <w:proofErr w:type="spellStart"/>
+      <w:r>
+        <w:rPr>
+          <w:rFonts w:ascii="Arial" w:hAnsi="Arial" w:cs="Arial"/>
+          <w:b/>
+          <w:bCs/>
+          <w:sz w:val="24"/>
+          <w:szCs w:val="24"/>
+          <w:rtl/>
+          <w:lang w:bidi="ar-DZ"/>
+        </w:rPr>
+        <w:t>مرجع</w:t>
+      </w:r>
+      <w:r>
+        <w:rPr>
+          <w:rFonts w:ascii="Arial" w:hAnsi="Arial" w:cs="Arial" w:hint="cs"/>
+          <w:b/>
+          <w:bCs/>
+          <w:sz w:val="24"/>
+          <w:szCs w:val="24"/>
+          <w:rtl/>
+          <w:lang w:bidi="ar-DZ"/>
+        </w:rPr>
+        <w:t>_</w:t>
+      </w:r>
+      <w:r>
+        <w:rPr>
+          <w:rFonts w:ascii="Arial" w:hAnsi="Arial" w:cs="Arial"/>
+          <w:b/>
+          <w:bCs/>
+          <w:sz w:val="24"/>
+          <w:szCs w:val="24"/>
+          <w:rtl/>
+          <w:lang w:bidi="ar-DZ"/>
+        </w:rPr>
+        <w:t>النقل</w:t>
+      </w:r>
+      <w:proofErr w:type="spellEnd"/>
       <w:proofErr w:type="gramStart"/>
       <w:r>
         <w:rPr>
-          <w:rFonts w:ascii="Arial" w:hAnsi="Arial" w:cs="Arial"/>
-          <w:b/>
-          <w:bCs/>
-          <w:sz w:val="24"/>
-          <w:szCs w:val="24"/>
-          <w:lang w:bidi="ar-DZ"/>
-        </w:rPr>
-        <w:t xml:space="preserve">{{ </w:t>
-      </w:r>
-      <w:proofErr w:type="spellStart"/>
-      <w:r>
-        <w:rPr>
-          <w:rFonts w:ascii="Arial" w:hAnsi="Arial" w:cs="Arial"/>
-          <w:b/>
-          <w:bCs/>
-          <w:sz w:val="24"/>
-          <w:szCs w:val="24"/>
-          <w:lang w:bidi="ar-DZ"/>
-        </w:rPr>
-        <w:t>مرجع</w:t>
+          <w:rFonts w:ascii="Arial" w:hAnsi="Arial" w:cs="Arial" w:hint="cs"/>
+          <w:b/>
+          <w:bCs/>
+          <w:sz w:val="24"/>
+          <w:szCs w:val="24"/>
+          <w:rtl/>
+          <w:lang w:bidi="ar-DZ"/>
+        </w:rPr>
+        <w:t xml:space="preserve">}}   </w:t>
       </w:r>
       <w:proofErr w:type="gramEnd"/>
       <w:r>
         <w:rPr>
-          <w:rFonts w:ascii="Arial" w:hAnsi="Arial" w:cs="Arial"/>
-          <w:b/>
-          <w:bCs/>
-          <w:sz w:val="24"/>
-          <w:szCs w:val="24"/>
-          <w:lang w:bidi="ar-DZ"/>
-        </w:rPr>
-        <w:t>_النقل</w:t>
-      </w:r>
-      <w:proofErr w:type="spellEnd"/>
-      <w:r>
-        <w:rPr>
-          <w:rFonts w:ascii="Arial" w:hAnsi="Arial" w:cs="Arial"/>
-          <w:b/>
-          <w:bCs/>
-          <w:sz w:val="24"/>
-          <w:szCs w:val="24"/>
-          <w:lang w:bidi="ar-DZ"/>
-        </w:rPr>
-        <w:t xml:space="preserve"> }}</w:t>
+          <w:rFonts w:ascii="Arial" w:hAnsi="Arial" w:cs="Arial" w:hint="cs"/>
+          <w:b/>
+          <w:bCs/>
+          <w:sz w:val="24"/>
+          <w:szCs w:val="24"/>
+          <w:rtl/>
+          <w:lang w:bidi="ar-DZ"/>
+        </w:rPr>
+        <w:t xml:space="preserve"> </w:t>
+      </w:r>
+      <w:r>
+        <w:rPr>
+          <w:rFonts w:ascii="Arial" w:hAnsi="Arial" w:cs="Arial"/>
+          <w:b/>
+          <w:bCs/>
+          <w:sz w:val="24"/>
+          <w:szCs w:val="24"/>
+          <w:rtl/>
+          <w:lang w:bidi="ar-DZ"/>
+        </w:rPr>
+        <w:tab/>
+      </w:r>
+      <w:r>
+        <w:rPr>
+          <w:rFonts w:ascii="Arial" w:hAnsi="Arial" w:cs="Arial" w:hint="cs"/>
+          <w:b/>
+          <w:bCs/>
+          <w:sz w:val="24"/>
+          <w:szCs w:val="24"/>
+          <w:rtl/>
+          <w:lang w:bidi="ar-DZ"/>
+        </w:rPr>
+        <w:t xml:space="preserve"> باخرة بحرية  </w:t>
       </w:r>
       <w:r>
         <w:rPr>
@@ -2945,9 +3022,9 @@
     </w:p>
     <w:p>
       <w:pPr>
+        <w:bidi/>
         <w:spacing w:line="240" w:lineRule="auto"/>
         <w:ind w:right="-426"/>
-        <w:jc w:val="right"/>
         <w:rPr>
           <w:rFonts w:ascii="Arial" w:hAnsi="Arial" w:cs="Arial"/>
           <w:b/>
@@ -3030,7 +3107,7 @@
           <w:rtl/>
           <w:lang w:bidi="ar-DZ"/>
         </w:rPr>
-        <w:t>{{ العبور }}</w:t>
+        <w:t>مباشر</w:t>
       </w:r>
       <w:r>
         <w:rPr>
@@ -3058,15 +3135,27 @@
       </w:r>
       <w:r>
         <w:rPr>
-          <w:rFonts w:ascii="Arial" w:hAnsi="Arial" w:cs="Arial"/>
-          <w:b/>
-          <w:bCs/>
-          <w:sz w:val="24"/>
-          <w:szCs w:val="24"/>
-          <w:rtl/>
-          <w:lang w:bidi="ar-DZ"/>
-        </w:rPr>
-        <w:t xml:space="preserve">{{ الوصول }} </w:t>
+          <w:rFonts w:ascii="Arial" w:hAnsi="Arial" w:cs="Arial" w:hint="cs"/>
+          <w:b/>
+          <w:bCs/>
+          <w:sz w:val="24"/>
+          <w:szCs w:val="24"/>
+          <w:rtl/>
+          <w:lang w:bidi="ar-DZ"/>
+        </w:rPr>
+        <w:t>عنابة</w:t>
+      </w:r>
+      <w:r>
+        <w:rPr>
+          <w:rFonts w:ascii="Arial" w:hAnsi="Arial" w:cs="Arial"/>
+          <w:b/>
+          <w:bCs/>
+          <w:sz w:val="24"/>
+          <w:szCs w:val="24"/>
+          <w:rtl/>
+          <w:lang w:bidi="ar-DZ"/>
+        </w:rPr>
+        <w:t xml:space="preserve"> </w:t>
       </w:r>
     </w:p>
     <w:p>

</xml_diff>